<commit_message>
P1: manuales y presentaciones TI.1.1 y TI.1.2, examen BanQuito GR07 y plantillas Moodle
</commit_message>
<xml_diff>
--- a/P1/TI.1.1. PAO202651_SOAP_JAVA_SINBDD_36883_GR07/01. UML/02. ECUD/ECUD_SOAP_JAVA_SINBDD_GR07.docx
+++ b/P1/TI.1.1. PAO202651_SOAP_JAVA_SINBDD_36883_GR07/01. UML/02. ECUD/ECUD_SOAP_JAVA_SINBDD_GR07.docx
@@ -343,7 +343,7 @@
                                 <w:szCs w:val="28"/>
                                 <w:lang w:eastAsia="es-EC"/>
                               </w:rPr>
-                              <w:t>14/10/2026</w:t>
+                              <w:t>27/10/2026</w:t>
                             </w:r>
                             <w:r>
                               <w:rPr>
@@ -656,7 +656,7 @@
                           <w:szCs w:val="28"/>
                           <w:lang w:eastAsia="es-EC"/>
                         </w:rPr>
-                        <w:t>14/10/2026</w:t>
+                        <w:t>27/10/2026</w:t>
                       </w:r>
                       <w:r>
                         <w:rPr>
@@ -4335,7 +4335,7 @@
       <w:pPr>
         <w:pStyle w:val="Ttulo1"/>
       </w:pPr>
-      <w:bookmarkStart w:id="0" w:name="_Toc242892539"/>
+      <w:bookmarkStart w:id="0" w:name="_Toc243988509"/>
       <w:r>
         <w:lastRenderedPageBreak/>
         <w:t xml:space="preserve">ESPECIFICACIÓN DE </w:t>
@@ -4388,7 +4388,7 @@
           <w:r>
             <w:fldChar w:fldCharType="separate"/>
           </w:r>
-          <w:hyperlink w:anchor="_Toc242892539" w:history="1">
+          <w:hyperlink w:anchor="_Toc243988509" w:history="1">
             <w:r>
               <w:rPr>
                 <w:rStyle w:val="Hipervnculo"/>
@@ -4415,7 +4415,7 @@
                 <w:noProof/>
                 <w:webHidden/>
               </w:rPr>
-              <w:instrText xml:space="preserve"> PAGEREF _Toc242892539 \h </w:instrText>
+              <w:instrText xml:space="preserve"> PAGEREF _Toc243988509 \h </w:instrText>
             </w:r>
             <w:r>
               <w:rPr>
@@ -4460,7 +4460,7 @@
               <w:lang w:val="es-MX" w:eastAsia="es-MX"/>
             </w:rPr>
           </w:pPr>
-          <w:hyperlink w:anchor="_Toc242892540" w:history="1">
+          <w:hyperlink w:anchor="_Toc243988510" w:history="1">
             <w:r>
               <w:rPr>
                 <w:rStyle w:val="Hipervnculo"/>
@@ -4503,7 +4503,7 @@
                 <w:noProof/>
                 <w:webHidden/>
               </w:rPr>
-              <w:instrText xml:space="preserve"> PAGEREF _Toc242892540 \h </w:instrText>
+              <w:instrText xml:space="preserve"> PAGEREF _Toc243988510 \h </w:instrText>
             </w:r>
             <w:r>
               <w:rPr>
@@ -4523,7 +4523,7 @@
                 <w:noProof/>
                 <w:webHidden/>
               </w:rPr>
-              <w:t>5</w:t>
+              <w:t>3</w:t>
             </w:r>
             <w:r>
               <w:rPr>
@@ -4548,7 +4548,7 @@
               <w:lang w:val="es-MX" w:eastAsia="es-MX"/>
             </w:rPr>
           </w:pPr>
-          <w:hyperlink w:anchor="_Toc242892541" w:history="1">
+          <w:hyperlink w:anchor="_Toc243988511" w:history="1">
             <w:r>
               <w:rPr>
                 <w:rStyle w:val="Hipervnculo"/>
@@ -4591,7 +4591,7 @@
                 <w:noProof/>
                 <w:webHidden/>
               </w:rPr>
-              <w:instrText xml:space="preserve"> PAGEREF _Toc242892541 \h </w:instrText>
+              <w:instrText xml:space="preserve"> PAGEREF _Toc243988511 \h </w:instrText>
             </w:r>
             <w:r>
               <w:rPr>
@@ -4611,7 +4611,7 @@
                 <w:noProof/>
                 <w:webHidden/>
               </w:rPr>
-              <w:t>5</w:t>
+              <w:t>3</w:t>
             </w:r>
             <w:r>
               <w:rPr>
@@ -4636,7 +4636,7 @@
               <w:lang w:val="es-MX" w:eastAsia="es-MX"/>
             </w:rPr>
           </w:pPr>
-          <w:hyperlink w:anchor="_Toc242892542" w:history="1">
+          <w:hyperlink w:anchor="_Toc243988512" w:history="1">
             <w:r>
               <w:rPr>
                 <w:rStyle w:val="Hipervnculo"/>
@@ -4679,7 +4679,7 @@
                 <w:noProof/>
                 <w:webHidden/>
               </w:rPr>
-              <w:instrText xml:space="preserve"> PAGEREF _Toc242892542 \h </w:instrText>
+              <w:instrText xml:space="preserve"> PAGEREF _Toc243988512 \h </w:instrText>
             </w:r>
             <w:r>
               <w:rPr>
@@ -4699,7 +4699,7 @@
                 <w:noProof/>
                 <w:webHidden/>
               </w:rPr>
-              <w:t>5</w:t>
+              <w:t>3</w:t>
             </w:r>
             <w:r>
               <w:rPr>
@@ -4724,7 +4724,7 @@
               <w:lang w:val="es-MX" w:eastAsia="es-MX"/>
             </w:rPr>
           </w:pPr>
-          <w:hyperlink w:anchor="_Toc242892543" w:history="1">
+          <w:hyperlink w:anchor="_Toc243988513" w:history="1">
             <w:r>
               <w:rPr>
                 <w:rStyle w:val="Hipervnculo"/>
@@ -4767,7 +4767,7 @@
                 <w:noProof/>
                 <w:webHidden/>
               </w:rPr>
-              <w:instrText xml:space="preserve"> PAGEREF _Toc242892543 \h </w:instrText>
+              <w:instrText xml:space="preserve"> PAGEREF _Toc243988513 \h </w:instrText>
             </w:r>
             <w:r>
               <w:rPr>
@@ -4787,7 +4787,7 @@
                 <w:noProof/>
                 <w:webHidden/>
               </w:rPr>
-              <w:t>5</w:t>
+              <w:t>4</w:t>
             </w:r>
             <w:r>
               <w:rPr>
@@ -4812,7 +4812,7 @@
               <w:lang w:val="es-MX" w:eastAsia="es-MX"/>
             </w:rPr>
           </w:pPr>
-          <w:hyperlink w:anchor="_Toc242892544" w:history="1">
+          <w:hyperlink w:anchor="_Toc243988514" w:history="1">
             <w:r>
               <w:rPr>
                 <w:rStyle w:val="Hipervnculo"/>
@@ -4855,7 +4855,7 @@
                 <w:noProof/>
                 <w:webHidden/>
               </w:rPr>
-              <w:instrText xml:space="preserve"> PAGEREF _Toc242892544 \h </w:instrText>
+              <w:instrText xml:space="preserve"> PAGEREF _Toc243988514 \h </w:instrText>
             </w:r>
             <w:r>
               <w:rPr>
@@ -4875,7 +4875,7 @@
                 <w:noProof/>
                 <w:webHidden/>
               </w:rPr>
-              <w:t>5</w:t>
+              <w:t>4</w:t>
             </w:r>
             <w:r>
               <w:rPr>
@@ -4900,7 +4900,7 @@
               <w:lang w:val="es-MX" w:eastAsia="es-MX"/>
             </w:rPr>
           </w:pPr>
-          <w:hyperlink w:anchor="_Toc242892545" w:history="1">
+          <w:hyperlink w:anchor="_Toc243988515" w:history="1">
             <w:r>
               <w:rPr>
                 <w:rStyle w:val="Hipervnculo"/>
@@ -4943,7 +4943,7 @@
                 <w:noProof/>
                 <w:webHidden/>
               </w:rPr>
-              <w:instrText xml:space="preserve"> PAGEREF _Toc242892545 \h </w:instrText>
+              <w:instrText xml:space="preserve"> PAGEREF _Toc243988515 \h </w:instrText>
             </w:r>
             <w:r>
               <w:rPr>
@@ -4963,7 +4963,7 @@
                 <w:noProof/>
                 <w:webHidden/>
               </w:rPr>
-              <w:t>6</w:t>
+              <w:t>4</w:t>
             </w:r>
             <w:r>
               <w:rPr>
@@ -4988,7 +4988,7 @@
               <w:lang w:val="es-MX" w:eastAsia="es-MX"/>
             </w:rPr>
           </w:pPr>
-          <w:hyperlink w:anchor="_Toc242892546" w:history="1">
+          <w:hyperlink w:anchor="_Toc243988516" w:history="1">
             <w:r>
               <w:rPr>
                 <w:rStyle w:val="Hipervnculo"/>
@@ -5031,7 +5031,7 @@
                 <w:noProof/>
                 <w:webHidden/>
               </w:rPr>
-              <w:instrText xml:space="preserve"> PAGEREF _Toc242892546 \h </w:instrText>
+              <w:instrText xml:space="preserve"> PAGEREF _Toc243988516 \h </w:instrText>
             </w:r>
             <w:r>
               <w:rPr>
@@ -5051,7 +5051,7 @@
                 <w:noProof/>
                 <w:webHidden/>
               </w:rPr>
-              <w:t>6</w:t>
+              <w:t>4</w:t>
             </w:r>
             <w:r>
               <w:rPr>
@@ -5076,7 +5076,7 @@
               <w:lang w:val="es-MX" w:eastAsia="es-MX"/>
             </w:rPr>
           </w:pPr>
-          <w:hyperlink w:anchor="_Toc242892547" w:history="1">
+          <w:hyperlink w:anchor="_Toc243988517" w:history="1">
             <w:r>
               <w:rPr>
                 <w:rStyle w:val="Hipervnculo"/>
@@ -5119,7 +5119,7 @@
                 <w:noProof/>
                 <w:webHidden/>
               </w:rPr>
-              <w:instrText xml:space="preserve"> PAGEREF _Toc242892547 \h </w:instrText>
+              <w:instrText xml:space="preserve"> PAGEREF _Toc243988517 \h </w:instrText>
             </w:r>
             <w:r>
               <w:rPr>
@@ -5139,7 +5139,7 @@
                 <w:noProof/>
                 <w:webHidden/>
               </w:rPr>
-              <w:t>6</w:t>
+              <w:t>5</w:t>
             </w:r>
             <w:r>
               <w:rPr>
@@ -5164,7 +5164,7 @@
               <w:lang w:val="es-MX" w:eastAsia="es-MX"/>
             </w:rPr>
           </w:pPr>
-          <w:hyperlink w:anchor="_Toc242892548" w:history="1">
+          <w:hyperlink w:anchor="_Toc243988518" w:history="1">
             <w:r>
               <w:rPr>
                 <w:rStyle w:val="Hipervnculo"/>
@@ -5207,7 +5207,7 @@
                 <w:noProof/>
                 <w:webHidden/>
               </w:rPr>
-              <w:instrText xml:space="preserve"> PAGEREF _Toc242892548 \h </w:instrText>
+              <w:instrText xml:space="preserve"> PAGEREF _Toc243988518 \h </w:instrText>
             </w:r>
             <w:r>
               <w:rPr>
@@ -5227,7 +5227,7 @@
                 <w:noProof/>
                 <w:webHidden/>
               </w:rPr>
-              <w:t>6</w:t>
+              <w:t>5</w:t>
             </w:r>
             <w:r>
               <w:rPr>
@@ -5252,7 +5252,7 @@
               <w:lang w:val="es-MX" w:eastAsia="es-MX"/>
             </w:rPr>
           </w:pPr>
-          <w:hyperlink w:anchor="_Toc242892549" w:history="1">
+          <w:hyperlink w:anchor="_Toc243988519" w:history="1">
             <w:r>
               <w:rPr>
                 <w:rStyle w:val="Hipervnculo"/>
@@ -5295,7 +5295,7 @@
                 <w:noProof/>
                 <w:webHidden/>
               </w:rPr>
-              <w:instrText xml:space="preserve"> PAGEREF _Toc242892549 \h </w:instrText>
+              <w:instrText xml:space="preserve"> PAGEREF _Toc243988519 \h </w:instrText>
             </w:r>
             <w:r>
               <w:rPr>
@@ -5315,7 +5315,7 @@
                 <w:noProof/>
                 <w:webHidden/>
               </w:rPr>
-              <w:t>7</w:t>
+              <w:t>6</w:t>
             </w:r>
             <w:r>
               <w:rPr>
@@ -5340,7 +5340,7 @@
               <w:lang w:val="es-MX" w:eastAsia="es-MX"/>
             </w:rPr>
           </w:pPr>
-          <w:hyperlink w:anchor="_Toc242892550" w:history="1">
+          <w:hyperlink w:anchor="_Toc243988520" w:history="1">
             <w:r>
               <w:rPr>
                 <w:rStyle w:val="Hipervnculo"/>
@@ -5383,7 +5383,7 @@
                 <w:noProof/>
                 <w:webHidden/>
               </w:rPr>
-              <w:instrText xml:space="preserve"> PAGEREF _Toc242892550 \h </w:instrText>
+              <w:instrText xml:space="preserve"> PAGEREF _Toc243988520 \h </w:instrText>
             </w:r>
             <w:r>
               <w:rPr>
@@ -5403,7 +5403,7 @@
                 <w:noProof/>
                 <w:webHidden/>
               </w:rPr>
-              <w:t>8</w:t>
+              <w:t>6</w:t>
             </w:r>
             <w:r>
               <w:rPr>
@@ -5428,7 +5428,7 @@
               <w:lang w:val="es-MX" w:eastAsia="es-MX"/>
             </w:rPr>
           </w:pPr>
-          <w:hyperlink w:anchor="_Toc242892551" w:history="1">
+          <w:hyperlink w:anchor="_Toc243988521" w:history="1">
             <w:r>
               <w:rPr>
                 <w:rStyle w:val="Hipervnculo"/>
@@ -5471,7 +5471,7 @@
                 <w:noProof/>
                 <w:webHidden/>
               </w:rPr>
-              <w:instrText xml:space="preserve"> PAGEREF _Toc242892551 \h </w:instrText>
+              <w:instrText xml:space="preserve"> PAGEREF _Toc243988521 \h </w:instrText>
             </w:r>
             <w:r>
               <w:rPr>
@@ -5491,7 +5491,7 @@
                 <w:noProof/>
                 <w:webHidden/>
               </w:rPr>
-              <w:t>8</w:t>
+              <w:t>6</w:t>
             </w:r>
             <w:r>
               <w:rPr>
@@ -5516,7 +5516,7 @@
               <w:lang w:val="es-MX" w:eastAsia="es-MX"/>
             </w:rPr>
           </w:pPr>
-          <w:hyperlink w:anchor="_Toc242892552" w:history="1">
+          <w:hyperlink w:anchor="_Toc243988522" w:history="1">
             <w:r>
               <w:rPr>
                 <w:rStyle w:val="Hipervnculo"/>
@@ -5559,7 +5559,7 @@
                 <w:noProof/>
                 <w:webHidden/>
               </w:rPr>
-              <w:instrText xml:space="preserve"> PAGEREF _Toc242892552 \h </w:instrText>
+              <w:instrText xml:space="preserve"> PAGEREF _Toc243988522 \h </w:instrText>
             </w:r>
             <w:r>
               <w:rPr>
@@ -5579,7 +5579,7 @@
                 <w:noProof/>
                 <w:webHidden/>
               </w:rPr>
-              <w:t>8</w:t>
+              <w:t>6</w:t>
             </w:r>
             <w:r>
               <w:rPr>
@@ -5604,7 +5604,7 @@
               <w:lang w:val="es-MX" w:eastAsia="es-MX"/>
             </w:rPr>
           </w:pPr>
-          <w:hyperlink w:anchor="_Toc242892553" w:history="1">
+          <w:hyperlink w:anchor="_Toc243988523" w:history="1">
             <w:r>
               <w:rPr>
                 <w:rStyle w:val="Hipervnculo"/>
@@ -5647,7 +5647,7 @@
                 <w:noProof/>
                 <w:webHidden/>
               </w:rPr>
-              <w:instrText xml:space="preserve"> PAGEREF _Toc242892553 \h </w:instrText>
+              <w:instrText xml:space="preserve"> PAGEREF _Toc243988523 \h </w:instrText>
             </w:r>
             <w:r>
               <w:rPr>
@@ -5667,7 +5667,7 @@
                 <w:noProof/>
                 <w:webHidden/>
               </w:rPr>
-              <w:t>8</w:t>
+              <w:t>6</w:t>
             </w:r>
             <w:r>
               <w:rPr>
@@ -5692,7 +5692,7 @@
               <w:lang w:val="es-MX" w:eastAsia="es-MX"/>
             </w:rPr>
           </w:pPr>
-          <w:hyperlink w:anchor="_Toc242892554" w:history="1">
+          <w:hyperlink w:anchor="_Toc243988524" w:history="1">
             <w:r>
               <w:rPr>
                 <w:rStyle w:val="Hipervnculo"/>
@@ -5735,7 +5735,7 @@
                 <w:noProof/>
                 <w:webHidden/>
               </w:rPr>
-              <w:instrText xml:space="preserve"> PAGEREF _Toc242892554 \h </w:instrText>
+              <w:instrText xml:space="preserve"> PAGEREF _Toc243988524 \h </w:instrText>
             </w:r>
             <w:r>
               <w:rPr>
@@ -5755,7 +5755,7 @@
                 <w:noProof/>
                 <w:webHidden/>
               </w:rPr>
-              <w:t>9</w:t>
+              <w:t>7</w:t>
             </w:r>
             <w:r>
               <w:rPr>
@@ -5780,7 +5780,7 @@
               <w:lang w:val="es-MX" w:eastAsia="es-MX"/>
             </w:rPr>
           </w:pPr>
-          <w:hyperlink w:anchor="_Toc242892555" w:history="1">
+          <w:hyperlink w:anchor="_Toc243988525" w:history="1">
             <w:r>
               <w:rPr>
                 <w:rStyle w:val="Hipervnculo"/>
@@ -5823,7 +5823,7 @@
                 <w:noProof/>
                 <w:webHidden/>
               </w:rPr>
-              <w:instrText xml:space="preserve"> PAGEREF _Toc242892555 \h </w:instrText>
+              <w:instrText xml:space="preserve"> PAGEREF _Toc243988525 \h </w:instrText>
             </w:r>
             <w:r>
               <w:rPr>
@@ -5843,7 +5843,7 @@
                 <w:noProof/>
                 <w:webHidden/>
               </w:rPr>
-              <w:t>9</w:t>
+              <w:t>7</w:t>
             </w:r>
             <w:r>
               <w:rPr>
@@ -5868,7 +5868,7 @@
               <w:lang w:val="es-MX" w:eastAsia="es-MX"/>
             </w:rPr>
           </w:pPr>
-          <w:hyperlink w:anchor="_Toc242892556" w:history="1">
+          <w:hyperlink w:anchor="_Toc243988526" w:history="1">
             <w:r>
               <w:rPr>
                 <w:rStyle w:val="Hipervnculo"/>
@@ -5911,7 +5911,7 @@
                 <w:noProof/>
                 <w:webHidden/>
               </w:rPr>
-              <w:instrText xml:space="preserve"> PAGEREF _Toc242892556 \h </w:instrText>
+              <w:instrText xml:space="preserve"> PAGEREF _Toc243988526 \h </w:instrText>
             </w:r>
             <w:r>
               <w:rPr>
@@ -5931,7 +5931,7 @@
                 <w:noProof/>
                 <w:webHidden/>
               </w:rPr>
-              <w:t>10</w:t>
+              <w:t>8</w:t>
             </w:r>
             <w:r>
               <w:rPr>
@@ -5956,7 +5956,7 @@
               <w:lang w:val="es-MX" w:eastAsia="es-MX"/>
             </w:rPr>
           </w:pPr>
-          <w:hyperlink w:anchor="_Toc242892557" w:history="1">
+          <w:hyperlink w:anchor="_Toc243988527" w:history="1">
             <w:r>
               <w:rPr>
                 <w:rStyle w:val="Hipervnculo"/>
@@ -5999,7 +5999,7 @@
                 <w:noProof/>
                 <w:webHidden/>
               </w:rPr>
-              <w:instrText xml:space="preserve"> PAGEREF _Toc242892557 \h </w:instrText>
+              <w:instrText xml:space="preserve"> PAGEREF _Toc243988527 \h </w:instrText>
             </w:r>
             <w:r>
               <w:rPr>
@@ -6019,7 +6019,7 @@
                 <w:noProof/>
                 <w:webHidden/>
               </w:rPr>
-              <w:t>11</w:t>
+              <w:t>9</w:t>
             </w:r>
             <w:r>
               <w:rPr>
@@ -6044,7 +6044,7 @@
               <w:lang w:val="es-MX" w:eastAsia="es-MX"/>
             </w:rPr>
           </w:pPr>
-          <w:hyperlink w:anchor="_Toc242892558" w:history="1">
+          <w:hyperlink w:anchor="_Toc243988528" w:history="1">
             <w:r>
               <w:rPr>
                 <w:rStyle w:val="Hipervnculo"/>
@@ -6087,7 +6087,7 @@
                 <w:noProof/>
                 <w:webHidden/>
               </w:rPr>
-              <w:instrText xml:space="preserve"> PAGEREF _Toc242892558 \h </w:instrText>
+              <w:instrText xml:space="preserve"> PAGEREF _Toc243988528 \h </w:instrText>
             </w:r>
             <w:r>
               <w:rPr>
@@ -6107,7 +6107,7 @@
                 <w:noProof/>
                 <w:webHidden/>
               </w:rPr>
-              <w:t>12</w:t>
+              <w:t>10</w:t>
             </w:r>
             <w:r>
               <w:rPr>
@@ -6132,7 +6132,7 @@
               <w:lang w:val="es-MX" w:eastAsia="es-MX"/>
             </w:rPr>
           </w:pPr>
-          <w:hyperlink w:anchor="_Toc242892559" w:history="1">
+          <w:hyperlink w:anchor="_Toc243988529" w:history="1">
             <w:r>
               <w:rPr>
                 <w:rStyle w:val="Hipervnculo"/>
@@ -6175,7 +6175,7 @@
                 <w:noProof/>
                 <w:webHidden/>
               </w:rPr>
-              <w:instrText xml:space="preserve"> PAGEREF _Toc242892559 \h </w:instrText>
+              <w:instrText xml:space="preserve"> PAGEREF _Toc243988529 \h </w:instrText>
             </w:r>
             <w:r>
               <w:rPr>
@@ -6195,7 +6195,7 @@
                 <w:noProof/>
                 <w:webHidden/>
               </w:rPr>
-              <w:t>13</w:t>
+              <w:t>11</w:t>
             </w:r>
             <w:r>
               <w:rPr>
@@ -6220,7 +6220,7 @@
               <w:lang w:val="es-MX" w:eastAsia="es-MX"/>
             </w:rPr>
           </w:pPr>
-          <w:hyperlink w:anchor="_Toc242892560" w:history="1">
+          <w:hyperlink w:anchor="_Toc243988530" w:history="1">
             <w:r>
               <w:rPr>
                 <w:rStyle w:val="Hipervnculo"/>
@@ -6263,7 +6263,7 @@
                 <w:noProof/>
                 <w:webHidden/>
               </w:rPr>
-              <w:instrText xml:space="preserve"> PAGEREF _Toc242892560 \h </w:instrText>
+              <w:instrText xml:space="preserve"> PAGEREF _Toc243988530 \h </w:instrText>
             </w:r>
             <w:r>
               <w:rPr>
@@ -6283,7 +6283,7 @@
                 <w:noProof/>
                 <w:webHidden/>
               </w:rPr>
-              <w:t>14</w:t>
+              <w:t>12</w:t>
             </w:r>
             <w:r>
               <w:rPr>
@@ -6308,7 +6308,7 @@
               <w:lang w:val="es-MX" w:eastAsia="es-MX"/>
             </w:rPr>
           </w:pPr>
-          <w:hyperlink w:anchor="_Toc242892561" w:history="1">
+          <w:hyperlink w:anchor="_Toc243988531" w:history="1">
             <w:r>
               <w:rPr>
                 <w:rStyle w:val="Hipervnculo"/>
@@ -6351,7 +6351,7 @@
                 <w:noProof/>
                 <w:webHidden/>
               </w:rPr>
-              <w:instrText xml:space="preserve"> PAGEREF _Toc242892561 \h </w:instrText>
+              <w:instrText xml:space="preserve"> PAGEREF _Toc243988531 \h </w:instrText>
             </w:r>
             <w:r>
               <w:rPr>
@@ -6371,7 +6371,7 @@
                 <w:noProof/>
                 <w:webHidden/>
               </w:rPr>
-              <w:t>15</w:t>
+              <w:t>13</w:t>
             </w:r>
             <w:r>
               <w:rPr>
@@ -6396,7 +6396,7 @@
               <w:lang w:val="es-MX" w:eastAsia="es-MX"/>
             </w:rPr>
           </w:pPr>
-          <w:hyperlink w:anchor="_Toc242892562" w:history="1">
+          <w:hyperlink w:anchor="_Toc243988532" w:history="1">
             <w:r>
               <w:rPr>
                 <w:rStyle w:val="Hipervnculo"/>
@@ -6439,7 +6439,7 @@
                 <w:noProof/>
                 <w:webHidden/>
               </w:rPr>
-              <w:instrText xml:space="preserve"> PAGEREF _Toc242892562 \h </w:instrText>
+              <w:instrText xml:space="preserve"> PAGEREF _Toc243988532 \h </w:instrText>
             </w:r>
             <w:r>
               <w:rPr>
@@ -6459,7 +6459,7 @@
                 <w:noProof/>
                 <w:webHidden/>
               </w:rPr>
-              <w:t>16</w:t>
+              <w:t>14</w:t>
             </w:r>
             <w:r>
               <w:rPr>
@@ -6484,7 +6484,7 @@
               <w:lang w:val="es-MX" w:eastAsia="es-MX"/>
             </w:rPr>
           </w:pPr>
-          <w:hyperlink w:anchor="_Toc242892563" w:history="1">
+          <w:hyperlink w:anchor="_Toc243988533" w:history="1">
             <w:r>
               <w:rPr>
                 <w:rStyle w:val="Hipervnculo"/>
@@ -6527,7 +6527,7 @@
                 <w:noProof/>
                 <w:webHidden/>
               </w:rPr>
-              <w:instrText xml:space="preserve"> PAGEREF _Toc242892563 \h </w:instrText>
+              <w:instrText xml:space="preserve"> PAGEREF _Toc243988533 \h </w:instrText>
             </w:r>
             <w:r>
               <w:rPr>
@@ -6547,7 +6547,7 @@
                 <w:noProof/>
                 <w:webHidden/>
               </w:rPr>
-              <w:t>16</w:t>
+              <w:t>15</w:t>
             </w:r>
             <w:r>
               <w:rPr>
@@ -6572,7 +6572,7 @@
               <w:lang w:val="es-MX" w:eastAsia="es-MX"/>
             </w:rPr>
           </w:pPr>
-          <w:hyperlink w:anchor="_Toc242892564" w:history="1">
+          <w:hyperlink w:anchor="_Toc243988534" w:history="1">
             <w:r>
               <w:rPr>
                 <w:rStyle w:val="Hipervnculo"/>
@@ -6615,7 +6615,7 @@
                 <w:noProof/>
                 <w:webHidden/>
               </w:rPr>
-              <w:instrText xml:space="preserve"> PAGEREF _Toc242892564 \h </w:instrText>
+              <w:instrText xml:space="preserve"> PAGEREF _Toc243988534 \h </w:instrText>
             </w:r>
             <w:r>
               <w:rPr>
@@ -6635,7 +6635,7 @@
                 <w:noProof/>
                 <w:webHidden/>
               </w:rPr>
-              <w:t>17</w:t>
+              <w:t>15</w:t>
             </w:r>
             <w:r>
               <w:rPr>
@@ -6660,7 +6660,7 @@
               <w:lang w:val="es-MX" w:eastAsia="es-MX"/>
             </w:rPr>
           </w:pPr>
-          <w:hyperlink w:anchor="_Toc242892565" w:history="1">
+          <w:hyperlink w:anchor="_Toc243988535" w:history="1">
             <w:r>
               <w:rPr>
                 <w:rStyle w:val="Hipervnculo"/>
@@ -6703,7 +6703,7 @@
                 <w:noProof/>
                 <w:webHidden/>
               </w:rPr>
-              <w:instrText xml:space="preserve"> PAGEREF _Toc242892565 \h </w:instrText>
+              <w:instrText xml:space="preserve"> PAGEREF _Toc243988535 \h </w:instrText>
             </w:r>
             <w:r>
               <w:rPr>
@@ -6723,7 +6723,7 @@
                 <w:noProof/>
                 <w:webHidden/>
               </w:rPr>
-              <w:t>18</w:t>
+              <w:t>16</w:t>
             </w:r>
             <w:r>
               <w:rPr>
@@ -6747,7 +6747,7 @@
               <w:lang w:val="es-MX" w:eastAsia="es-MX"/>
             </w:rPr>
           </w:pPr>
-          <w:hyperlink w:anchor="_Toc242892566" w:history="1">
+          <w:hyperlink w:anchor="_Toc243988536" w:history="1">
             <w:r>
               <w:rPr>
                 <w:rStyle w:val="Hipervnculo"/>
@@ -6774,7 +6774,7 @@
                 <w:noProof/>
                 <w:webHidden/>
               </w:rPr>
-              <w:instrText xml:space="preserve"> PAGEREF _Toc242892566 \h </w:instrText>
+              <w:instrText xml:space="preserve"> PAGEREF _Toc243988536 \h </w:instrText>
             </w:r>
             <w:r>
               <w:rPr>
@@ -6794,7 +6794,7 @@
                 <w:noProof/>
                 <w:webHidden/>
               </w:rPr>
-              <w:t>19</w:t>
+              <w:t>17</w:t>
             </w:r>
             <w:r>
               <w:rPr>
@@ -6818,7 +6818,7 @@
               <w:lang w:val="es-MX" w:eastAsia="es-MX"/>
             </w:rPr>
           </w:pPr>
-          <w:hyperlink w:anchor="_Toc242892567" w:history="1">
+          <w:hyperlink w:anchor="_Toc243988537" w:history="1">
             <w:r>
               <w:rPr>
                 <w:rStyle w:val="Hipervnculo"/>
@@ -6845,7 +6845,7 @@
                 <w:noProof/>
                 <w:webHidden/>
               </w:rPr>
-              <w:instrText xml:space="preserve"> PAGEREF _Toc242892567 \h </w:instrText>
+              <w:instrText xml:space="preserve"> PAGEREF _Toc243988537 \h </w:instrText>
             </w:r>
             <w:r>
               <w:rPr>
@@ -6865,7 +6865,7 @@
                 <w:noProof/>
                 <w:webHidden/>
               </w:rPr>
-              <w:t>19</w:t>
+              <w:t>17</w:t>
             </w:r>
             <w:r>
               <w:rPr>
@@ -6889,7 +6889,7 @@
               <w:lang w:val="es-MX" w:eastAsia="es-MX"/>
             </w:rPr>
           </w:pPr>
-          <w:hyperlink w:anchor="_Toc242892568" w:history="1">
+          <w:hyperlink w:anchor="_Toc243988538" w:history="1">
             <w:r>
               <w:rPr>
                 <w:rStyle w:val="Hipervnculo"/>
@@ -6916,7 +6916,7 @@
                 <w:noProof/>
                 <w:webHidden/>
               </w:rPr>
-              <w:instrText xml:space="preserve"> PAGEREF _Toc242892568 \h </w:instrText>
+              <w:instrText xml:space="preserve"> PAGEREF _Toc243988538 \h </w:instrText>
             </w:r>
             <w:r>
               <w:rPr>
@@ -6936,7 +6936,7 @@
                 <w:noProof/>
                 <w:webHidden/>
               </w:rPr>
-              <w:t>19</w:t>
+              <w:t>17</w:t>
             </w:r>
             <w:r>
               <w:rPr>
@@ -7007,7 +7007,7 @@
       <w:r>
         <w:fldChar w:fldCharType="separate"/>
       </w:r>
-      <w:hyperlink w:anchor="_Toc242892569" w:history="1">
+      <w:hyperlink w:anchor="_Toc243988539" w:history="1">
         <w:r>
           <w:rPr>
             <w:rStyle w:val="Hipervnculo"/>
@@ -7034,7 +7034,961 @@
             <w:noProof/>
             <w:webHidden/>
           </w:rPr>
-          <w:instrText xml:space="preserve"> PAGEREF _Toc242892569 \h </w:instrText>
+          <w:instrText xml:space="preserve"> PAGEREF _Toc243988539 \h </w:instrText>
+        </w:r>
+        <w:r>
+          <w:rPr>
+            <w:noProof/>
+            <w:webHidden/>
+          </w:rPr>
+        </w:r>
+        <w:r>
+          <w:rPr>
+            <w:noProof/>
+            <w:webHidden/>
+          </w:rPr>
+          <w:fldChar w:fldCharType="separate"/>
+        </w:r>
+        <w:r>
+          <w:rPr>
+            <w:noProof/>
+            <w:webHidden/>
+          </w:rPr>
+          <w:t>6</w:t>
+        </w:r>
+        <w:r>
+          <w:rPr>
+            <w:noProof/>
+            <w:webHidden/>
+          </w:rPr>
+          <w:fldChar w:fldCharType="end"/>
+        </w:r>
+      </w:hyperlink>
+    </w:p>
+    <w:p>
+      <w:r>
+        <w:fldChar w:fldCharType="end"/>
+      </w:r>
+    </w:p>
+    <w:p>
+      <w:pPr>
+        <w:spacing w:before="0" w:after="0"/>
+        <w:jc w:val="left"/>
+      </w:pPr>
+    </w:p>
+    <w:p>
+      <w:pPr>
+        <w:pStyle w:val="TtuloTDC"/>
+      </w:pPr>
+      <w:r>
+        <w:t>ÍNDICE</w:t>
+      </w:r>
+      <w:r>
+        <w:t xml:space="preserve"> DE TABLAS</w:t>
+      </w:r>
+    </w:p>
+    <w:p>
+      <w:pPr>
+        <w:pStyle w:val="Tabladeilustraciones"/>
+        <w:tabs>
+          <w:tab w:val="right" w:leader="dot" w:pos="9020"/>
+        </w:tabs>
+        <w:rPr>
+          <w:rFonts w:asciiTheme="minorHAnsi" w:eastAsiaTheme="minorEastAsia" w:hAnsiTheme="minorHAnsi" w:cstheme="minorBidi"/>
+          <w:noProof/>
+          <w:sz w:val="22"/>
+          <w:lang w:val="es-MX" w:eastAsia="es-MX"/>
+        </w:rPr>
+      </w:pPr>
+      <w:r>
+        <w:fldChar w:fldCharType="begin"/>
+      </w:r>
+      <w:r>
+        <w:instrText xml:space="preserve"> TOC \h \z \c "Tabla" </w:instrText>
+      </w:r>
+      <w:r>
+        <w:fldChar w:fldCharType="separate"/>
+      </w:r>
+      <w:hyperlink w:anchor="_Toc243988540" w:history="1">
+        <w:r>
+          <w:rPr>
+            <w:rStyle w:val="Hipervnculo"/>
+            <w:noProof/>
+          </w:rPr>
+          <w:t>Tabla 1. Definiciones</w:t>
+        </w:r>
+        <w:r>
+          <w:rPr>
+            <w:noProof/>
+            <w:webHidden/>
+          </w:rPr>
+          <w:tab/>
+        </w:r>
+        <w:r>
+          <w:rPr>
+            <w:noProof/>
+            <w:webHidden/>
+          </w:rPr>
+          <w:fldChar w:fldCharType="begin"/>
+        </w:r>
+        <w:r>
+          <w:rPr>
+            <w:noProof/>
+            <w:webHidden/>
+          </w:rPr>
+          <w:instrText xml:space="preserve"> PAGEREF _Toc243988540 \h </w:instrText>
+        </w:r>
+        <w:r>
+          <w:rPr>
+            <w:noProof/>
+            <w:webHidden/>
+          </w:rPr>
+        </w:r>
+        <w:r>
+          <w:rPr>
+            <w:noProof/>
+            <w:webHidden/>
+          </w:rPr>
+          <w:fldChar w:fldCharType="separate"/>
+        </w:r>
+        <w:r>
+          <w:rPr>
+            <w:noProof/>
+            <w:webHidden/>
+          </w:rPr>
+          <w:t>4</w:t>
+        </w:r>
+        <w:r>
+          <w:rPr>
+            <w:noProof/>
+            <w:webHidden/>
+          </w:rPr>
+          <w:fldChar w:fldCharType="end"/>
+        </w:r>
+      </w:hyperlink>
+    </w:p>
+    <w:p>
+      <w:pPr>
+        <w:pStyle w:val="Tabladeilustraciones"/>
+        <w:tabs>
+          <w:tab w:val="right" w:leader="dot" w:pos="9020"/>
+        </w:tabs>
+        <w:rPr>
+          <w:rFonts w:asciiTheme="minorHAnsi" w:eastAsiaTheme="minorEastAsia" w:hAnsiTheme="minorHAnsi" w:cstheme="minorBidi"/>
+          <w:noProof/>
+          <w:sz w:val="22"/>
+          <w:lang w:val="es-MX" w:eastAsia="es-MX"/>
+        </w:rPr>
+      </w:pPr>
+      <w:hyperlink w:anchor="_Toc243988541" w:history="1">
+        <w:r>
+          <w:rPr>
+            <w:rStyle w:val="Hipervnculo"/>
+            <w:noProof/>
+          </w:rPr>
+          <w:t>Tabla 2. Acrónimos y abreviaturas</w:t>
+        </w:r>
+        <w:r>
+          <w:rPr>
+            <w:noProof/>
+            <w:webHidden/>
+          </w:rPr>
+          <w:tab/>
+        </w:r>
+        <w:r>
+          <w:rPr>
+            <w:noProof/>
+            <w:webHidden/>
+          </w:rPr>
+          <w:fldChar w:fldCharType="begin"/>
+        </w:r>
+        <w:r>
+          <w:rPr>
+            <w:noProof/>
+            <w:webHidden/>
+          </w:rPr>
+          <w:instrText xml:space="preserve"> PAGEREF _Toc243988541 \h </w:instrText>
+        </w:r>
+        <w:r>
+          <w:rPr>
+            <w:noProof/>
+            <w:webHidden/>
+          </w:rPr>
+        </w:r>
+        <w:r>
+          <w:rPr>
+            <w:noProof/>
+            <w:webHidden/>
+          </w:rPr>
+          <w:fldChar w:fldCharType="separate"/>
+        </w:r>
+        <w:r>
+          <w:rPr>
+            <w:noProof/>
+            <w:webHidden/>
+          </w:rPr>
+          <w:t>4</w:t>
+        </w:r>
+        <w:r>
+          <w:rPr>
+            <w:noProof/>
+            <w:webHidden/>
+          </w:rPr>
+          <w:fldChar w:fldCharType="end"/>
+        </w:r>
+      </w:hyperlink>
+    </w:p>
+    <w:p>
+      <w:pPr>
+        <w:pStyle w:val="Tabladeilustraciones"/>
+        <w:tabs>
+          <w:tab w:val="right" w:leader="dot" w:pos="9020"/>
+        </w:tabs>
+        <w:rPr>
+          <w:rFonts w:asciiTheme="minorHAnsi" w:eastAsiaTheme="minorEastAsia" w:hAnsiTheme="minorHAnsi" w:cstheme="minorBidi"/>
+          <w:noProof/>
+          <w:sz w:val="22"/>
+          <w:lang w:val="es-MX" w:eastAsia="es-MX"/>
+        </w:rPr>
+      </w:pPr>
+      <w:hyperlink w:anchor="_Toc243988542" w:history="1">
+        <w:r>
+          <w:rPr>
+            <w:rStyle w:val="Hipervnculo"/>
+            <w:noProof/>
+          </w:rPr>
+          <w:t>Tabla 3. Referencias</w:t>
+        </w:r>
+        <w:r>
+          <w:rPr>
+            <w:noProof/>
+            <w:webHidden/>
+          </w:rPr>
+          <w:tab/>
+        </w:r>
+        <w:r>
+          <w:rPr>
+            <w:noProof/>
+            <w:webHidden/>
+          </w:rPr>
+          <w:fldChar w:fldCharType="begin"/>
+        </w:r>
+        <w:r>
+          <w:rPr>
+            <w:noProof/>
+            <w:webHidden/>
+          </w:rPr>
+          <w:instrText xml:space="preserve"> PAGEREF _Toc243988542 \h </w:instrText>
+        </w:r>
+        <w:r>
+          <w:rPr>
+            <w:noProof/>
+            <w:webHidden/>
+          </w:rPr>
+        </w:r>
+        <w:r>
+          <w:rPr>
+            <w:noProof/>
+            <w:webHidden/>
+          </w:rPr>
+          <w:fldChar w:fldCharType="separate"/>
+        </w:r>
+        <w:r>
+          <w:rPr>
+            <w:noProof/>
+            <w:webHidden/>
+          </w:rPr>
+          <w:t>4</w:t>
+        </w:r>
+        <w:r>
+          <w:rPr>
+            <w:noProof/>
+            <w:webHidden/>
+          </w:rPr>
+          <w:fldChar w:fldCharType="end"/>
+        </w:r>
+      </w:hyperlink>
+    </w:p>
+    <w:p>
+      <w:pPr>
+        <w:pStyle w:val="Tabladeilustraciones"/>
+        <w:tabs>
+          <w:tab w:val="right" w:leader="dot" w:pos="9020"/>
+        </w:tabs>
+        <w:rPr>
+          <w:rFonts w:asciiTheme="minorHAnsi" w:eastAsiaTheme="minorEastAsia" w:hAnsiTheme="minorHAnsi" w:cstheme="minorBidi"/>
+          <w:noProof/>
+          <w:sz w:val="22"/>
+          <w:lang w:val="es-MX" w:eastAsia="es-MX"/>
+        </w:rPr>
+      </w:pPr>
+      <w:hyperlink w:anchor="_Toc243988543" w:history="1">
+        <w:r>
+          <w:rPr>
+            <w:rStyle w:val="Hipervnculo"/>
+            <w:noProof/>
+          </w:rPr>
+          <w:t>Tabla 4. Actor Usuario</w:t>
+        </w:r>
+        <w:r>
+          <w:rPr>
+            <w:noProof/>
+            <w:webHidden/>
+          </w:rPr>
+          <w:tab/>
+        </w:r>
+        <w:r>
+          <w:rPr>
+            <w:noProof/>
+            <w:webHidden/>
+          </w:rPr>
+          <w:fldChar w:fldCharType="begin"/>
+        </w:r>
+        <w:r>
+          <w:rPr>
+            <w:noProof/>
+            <w:webHidden/>
+          </w:rPr>
+          <w:instrText xml:space="preserve"> PAGEREF _Toc243988543 \h </w:instrText>
+        </w:r>
+        <w:r>
+          <w:rPr>
+            <w:noProof/>
+            <w:webHidden/>
+          </w:rPr>
+        </w:r>
+        <w:r>
+          <w:rPr>
+            <w:noProof/>
+            <w:webHidden/>
+          </w:rPr>
+          <w:fldChar w:fldCharType="separate"/>
+        </w:r>
+        <w:r>
+          <w:rPr>
+            <w:noProof/>
+            <w:webHidden/>
+          </w:rPr>
+          <w:t>5</w:t>
+        </w:r>
+        <w:r>
+          <w:rPr>
+            <w:noProof/>
+            <w:webHidden/>
+          </w:rPr>
+          <w:fldChar w:fldCharType="end"/>
+        </w:r>
+      </w:hyperlink>
+    </w:p>
+    <w:p>
+      <w:pPr>
+        <w:pStyle w:val="Tabladeilustraciones"/>
+        <w:tabs>
+          <w:tab w:val="right" w:leader="dot" w:pos="9020"/>
+        </w:tabs>
+        <w:rPr>
+          <w:rFonts w:asciiTheme="minorHAnsi" w:eastAsiaTheme="minorEastAsia" w:hAnsiTheme="minorHAnsi" w:cstheme="minorBidi"/>
+          <w:noProof/>
+          <w:sz w:val="22"/>
+          <w:lang w:val="es-MX" w:eastAsia="es-MX"/>
+        </w:rPr>
+      </w:pPr>
+      <w:hyperlink w:anchor="_Toc243988544" w:history="1">
+        <w:r>
+          <w:rPr>
+            <w:rStyle w:val="Hipervnculo"/>
+            <w:noProof/>
+          </w:rPr>
+          <w:t>Tabla 5. Actor Cliente Consola</w:t>
+        </w:r>
+        <w:r>
+          <w:rPr>
+            <w:noProof/>
+            <w:webHidden/>
+          </w:rPr>
+          <w:tab/>
+        </w:r>
+        <w:r>
+          <w:rPr>
+            <w:noProof/>
+            <w:webHidden/>
+          </w:rPr>
+          <w:fldChar w:fldCharType="begin"/>
+        </w:r>
+        <w:r>
+          <w:rPr>
+            <w:noProof/>
+            <w:webHidden/>
+          </w:rPr>
+          <w:instrText xml:space="preserve"> PAGEREF _Toc243988544 \h </w:instrText>
+        </w:r>
+        <w:r>
+          <w:rPr>
+            <w:noProof/>
+            <w:webHidden/>
+          </w:rPr>
+        </w:r>
+        <w:r>
+          <w:rPr>
+            <w:noProof/>
+            <w:webHidden/>
+          </w:rPr>
+          <w:fldChar w:fldCharType="separate"/>
+        </w:r>
+        <w:r>
+          <w:rPr>
+            <w:noProof/>
+            <w:webHidden/>
+          </w:rPr>
+          <w:t>5</w:t>
+        </w:r>
+        <w:r>
+          <w:rPr>
+            <w:noProof/>
+            <w:webHidden/>
+          </w:rPr>
+          <w:fldChar w:fldCharType="end"/>
+        </w:r>
+      </w:hyperlink>
+    </w:p>
+    <w:p>
+      <w:pPr>
+        <w:pStyle w:val="Tabladeilustraciones"/>
+        <w:tabs>
+          <w:tab w:val="right" w:leader="dot" w:pos="9020"/>
+        </w:tabs>
+        <w:rPr>
+          <w:rFonts w:asciiTheme="minorHAnsi" w:eastAsiaTheme="minorEastAsia" w:hAnsiTheme="minorHAnsi" w:cstheme="minorBidi"/>
+          <w:noProof/>
+          <w:sz w:val="22"/>
+          <w:lang w:val="es-MX" w:eastAsia="es-MX"/>
+        </w:rPr>
+      </w:pPr>
+      <w:hyperlink w:anchor="_Toc243988545" w:history="1">
+        <w:r>
+          <w:rPr>
+            <w:rStyle w:val="Hipervnculo"/>
+            <w:noProof/>
+          </w:rPr>
+          <w:t>Tabla 6. Actor Cliente Escritorio</w:t>
+        </w:r>
+        <w:r>
+          <w:rPr>
+            <w:noProof/>
+            <w:webHidden/>
+          </w:rPr>
+          <w:tab/>
+        </w:r>
+        <w:r>
+          <w:rPr>
+            <w:noProof/>
+            <w:webHidden/>
+          </w:rPr>
+          <w:fldChar w:fldCharType="begin"/>
+        </w:r>
+        <w:r>
+          <w:rPr>
+            <w:noProof/>
+            <w:webHidden/>
+          </w:rPr>
+          <w:instrText xml:space="preserve"> PAGEREF _Toc243988545 \h </w:instrText>
+        </w:r>
+        <w:r>
+          <w:rPr>
+            <w:noProof/>
+            <w:webHidden/>
+          </w:rPr>
+        </w:r>
+        <w:r>
+          <w:rPr>
+            <w:noProof/>
+            <w:webHidden/>
+          </w:rPr>
+          <w:fldChar w:fldCharType="separate"/>
+        </w:r>
+        <w:r>
+          <w:rPr>
+            <w:noProof/>
+            <w:webHidden/>
+          </w:rPr>
+          <w:t>5</w:t>
+        </w:r>
+        <w:r>
+          <w:rPr>
+            <w:noProof/>
+            <w:webHidden/>
+          </w:rPr>
+          <w:fldChar w:fldCharType="end"/>
+        </w:r>
+      </w:hyperlink>
+    </w:p>
+    <w:p>
+      <w:pPr>
+        <w:pStyle w:val="Tabladeilustraciones"/>
+        <w:tabs>
+          <w:tab w:val="right" w:leader="dot" w:pos="9020"/>
+        </w:tabs>
+        <w:rPr>
+          <w:rFonts w:asciiTheme="minorHAnsi" w:eastAsiaTheme="minorEastAsia" w:hAnsiTheme="minorHAnsi" w:cstheme="minorBidi"/>
+          <w:noProof/>
+          <w:sz w:val="22"/>
+          <w:lang w:val="es-MX" w:eastAsia="es-MX"/>
+        </w:rPr>
+      </w:pPr>
+      <w:hyperlink w:anchor="_Toc243988546" w:history="1">
+        <w:r>
+          <w:rPr>
+            <w:rStyle w:val="Hipervnculo"/>
+            <w:noProof/>
+          </w:rPr>
+          <w:t>Tabla 7. Actor Cliente Web</w:t>
+        </w:r>
+        <w:r>
+          <w:rPr>
+            <w:noProof/>
+            <w:webHidden/>
+          </w:rPr>
+          <w:tab/>
+        </w:r>
+        <w:r>
+          <w:rPr>
+            <w:noProof/>
+            <w:webHidden/>
+          </w:rPr>
+          <w:fldChar w:fldCharType="begin"/>
+        </w:r>
+        <w:r>
+          <w:rPr>
+            <w:noProof/>
+            <w:webHidden/>
+          </w:rPr>
+          <w:instrText xml:space="preserve"> PAGEREF _Toc243988546 \h </w:instrText>
+        </w:r>
+        <w:r>
+          <w:rPr>
+            <w:noProof/>
+            <w:webHidden/>
+          </w:rPr>
+        </w:r>
+        <w:r>
+          <w:rPr>
+            <w:noProof/>
+            <w:webHidden/>
+          </w:rPr>
+          <w:fldChar w:fldCharType="separate"/>
+        </w:r>
+        <w:r>
+          <w:rPr>
+            <w:noProof/>
+            <w:webHidden/>
+          </w:rPr>
+          <w:t>5</w:t>
+        </w:r>
+        <w:r>
+          <w:rPr>
+            <w:noProof/>
+            <w:webHidden/>
+          </w:rPr>
+          <w:fldChar w:fldCharType="end"/>
+        </w:r>
+      </w:hyperlink>
+    </w:p>
+    <w:p>
+      <w:pPr>
+        <w:pStyle w:val="Tabladeilustraciones"/>
+        <w:tabs>
+          <w:tab w:val="right" w:leader="dot" w:pos="9020"/>
+        </w:tabs>
+        <w:rPr>
+          <w:rFonts w:asciiTheme="minorHAnsi" w:eastAsiaTheme="minorEastAsia" w:hAnsiTheme="minorHAnsi" w:cstheme="minorBidi"/>
+          <w:noProof/>
+          <w:sz w:val="22"/>
+          <w:lang w:val="es-MX" w:eastAsia="es-MX"/>
+        </w:rPr>
+      </w:pPr>
+      <w:hyperlink w:anchor="_Toc243988547" w:history="1">
+        <w:r>
+          <w:rPr>
+            <w:rStyle w:val="Hipervnculo"/>
+            <w:noProof/>
+          </w:rPr>
+          <w:t>Tabla 8. Actor Cliente Móvil Android</w:t>
+        </w:r>
+        <w:r>
+          <w:rPr>
+            <w:noProof/>
+            <w:webHidden/>
+          </w:rPr>
+          <w:tab/>
+        </w:r>
+        <w:r>
+          <w:rPr>
+            <w:noProof/>
+            <w:webHidden/>
+          </w:rPr>
+          <w:fldChar w:fldCharType="begin"/>
+        </w:r>
+        <w:r>
+          <w:rPr>
+            <w:noProof/>
+            <w:webHidden/>
+          </w:rPr>
+          <w:instrText xml:space="preserve"> PAGEREF _Toc243988547 \h </w:instrText>
+        </w:r>
+        <w:r>
+          <w:rPr>
+            <w:noProof/>
+            <w:webHidden/>
+          </w:rPr>
+        </w:r>
+        <w:r>
+          <w:rPr>
+            <w:noProof/>
+            <w:webHidden/>
+          </w:rPr>
+          <w:fldChar w:fldCharType="separate"/>
+        </w:r>
+        <w:r>
+          <w:rPr>
+            <w:noProof/>
+            <w:webHidden/>
+          </w:rPr>
+          <w:t>5</w:t>
+        </w:r>
+        <w:r>
+          <w:rPr>
+            <w:noProof/>
+            <w:webHidden/>
+          </w:rPr>
+          <w:fldChar w:fldCharType="end"/>
+        </w:r>
+      </w:hyperlink>
+    </w:p>
+    <w:p>
+      <w:pPr>
+        <w:pStyle w:val="Tabladeilustraciones"/>
+        <w:tabs>
+          <w:tab w:val="right" w:leader="dot" w:pos="9020"/>
+        </w:tabs>
+        <w:rPr>
+          <w:rFonts w:asciiTheme="minorHAnsi" w:eastAsiaTheme="minorEastAsia" w:hAnsiTheme="minorHAnsi" w:cstheme="minorBidi"/>
+          <w:noProof/>
+          <w:sz w:val="22"/>
+          <w:lang w:val="es-MX" w:eastAsia="es-MX"/>
+        </w:rPr>
+      </w:pPr>
+      <w:hyperlink w:anchor="_Toc243988548" w:history="1">
+        <w:r>
+          <w:rPr>
+            <w:rStyle w:val="Hipervnculo"/>
+            <w:noProof/>
+          </w:rPr>
+          <w:t>Tabla 9. Lista de casos de uso</w:t>
+        </w:r>
+        <w:r>
+          <w:rPr>
+            <w:noProof/>
+            <w:webHidden/>
+          </w:rPr>
+          <w:tab/>
+        </w:r>
+        <w:r>
+          <w:rPr>
+            <w:noProof/>
+            <w:webHidden/>
+          </w:rPr>
+          <w:fldChar w:fldCharType="begin"/>
+        </w:r>
+        <w:r>
+          <w:rPr>
+            <w:noProof/>
+            <w:webHidden/>
+          </w:rPr>
+          <w:instrText xml:space="preserve"> PAGEREF _Toc243988548 \h </w:instrText>
+        </w:r>
+        <w:r>
+          <w:rPr>
+            <w:noProof/>
+            <w:webHidden/>
+          </w:rPr>
+        </w:r>
+        <w:r>
+          <w:rPr>
+            <w:noProof/>
+            <w:webHidden/>
+          </w:rPr>
+          <w:fldChar w:fldCharType="separate"/>
+        </w:r>
+        <w:r>
+          <w:rPr>
+            <w:noProof/>
+            <w:webHidden/>
+          </w:rPr>
+          <w:t>6</w:t>
+        </w:r>
+        <w:r>
+          <w:rPr>
+            <w:noProof/>
+            <w:webHidden/>
+          </w:rPr>
+          <w:fldChar w:fldCharType="end"/>
+        </w:r>
+      </w:hyperlink>
+    </w:p>
+    <w:p>
+      <w:pPr>
+        <w:pStyle w:val="Tabladeilustraciones"/>
+        <w:tabs>
+          <w:tab w:val="right" w:leader="dot" w:pos="9020"/>
+        </w:tabs>
+        <w:rPr>
+          <w:rFonts w:asciiTheme="minorHAnsi" w:eastAsiaTheme="minorEastAsia" w:hAnsiTheme="minorHAnsi" w:cstheme="minorBidi"/>
+          <w:noProof/>
+          <w:sz w:val="22"/>
+          <w:lang w:val="es-MX" w:eastAsia="es-MX"/>
+        </w:rPr>
+      </w:pPr>
+      <w:hyperlink w:anchor="_Toc243988549" w:history="1">
+        <w:r>
+          <w:rPr>
+            <w:rStyle w:val="Hipervnculo"/>
+            <w:noProof/>
+          </w:rPr>
+          <w:t>Tabla 10. Campos de la respuesta estructurada</w:t>
+        </w:r>
+        <w:r>
+          <w:rPr>
+            <w:noProof/>
+            <w:webHidden/>
+          </w:rPr>
+          <w:tab/>
+        </w:r>
+        <w:r>
+          <w:rPr>
+            <w:noProof/>
+            <w:webHidden/>
+          </w:rPr>
+          <w:fldChar w:fldCharType="begin"/>
+        </w:r>
+        <w:r>
+          <w:rPr>
+            <w:noProof/>
+            <w:webHidden/>
+          </w:rPr>
+          <w:instrText xml:space="preserve"> PAGEREF _Toc243988549 \h </w:instrText>
+        </w:r>
+        <w:r>
+          <w:rPr>
+            <w:noProof/>
+            <w:webHidden/>
+          </w:rPr>
+        </w:r>
+        <w:r>
+          <w:rPr>
+            <w:noProof/>
+            <w:webHidden/>
+          </w:rPr>
+          <w:fldChar w:fldCharType="separate"/>
+        </w:r>
+        <w:r>
+          <w:rPr>
+            <w:noProof/>
+            <w:webHidden/>
+          </w:rPr>
+          <w:t>7</w:t>
+        </w:r>
+        <w:r>
+          <w:rPr>
+            <w:noProof/>
+            <w:webHidden/>
+          </w:rPr>
+          <w:fldChar w:fldCharType="end"/>
+        </w:r>
+      </w:hyperlink>
+    </w:p>
+    <w:p>
+      <w:pPr>
+        <w:pStyle w:val="Tabladeilustraciones"/>
+        <w:tabs>
+          <w:tab w:val="right" w:leader="dot" w:pos="9020"/>
+        </w:tabs>
+        <w:rPr>
+          <w:rFonts w:asciiTheme="minorHAnsi" w:eastAsiaTheme="minorEastAsia" w:hAnsiTheme="minorHAnsi" w:cstheme="minorBidi"/>
+          <w:noProof/>
+          <w:sz w:val="22"/>
+          <w:lang w:val="es-MX" w:eastAsia="es-MX"/>
+        </w:rPr>
+      </w:pPr>
+      <w:hyperlink w:anchor="_Toc243988550" w:history="1">
+        <w:r>
+          <w:rPr>
+            <w:rStyle w:val="Hipervnculo"/>
+            <w:noProof/>
+          </w:rPr>
+          <w:t>Tabla 11. Códigos de resultado</w:t>
+        </w:r>
+        <w:r>
+          <w:rPr>
+            <w:noProof/>
+            <w:webHidden/>
+          </w:rPr>
+          <w:tab/>
+        </w:r>
+        <w:r>
+          <w:rPr>
+            <w:noProof/>
+            <w:webHidden/>
+          </w:rPr>
+          <w:fldChar w:fldCharType="begin"/>
+        </w:r>
+        <w:r>
+          <w:rPr>
+            <w:noProof/>
+            <w:webHidden/>
+          </w:rPr>
+          <w:instrText xml:space="preserve"> PAGEREF _Toc243988550 \h </w:instrText>
+        </w:r>
+        <w:r>
+          <w:rPr>
+            <w:noProof/>
+            <w:webHidden/>
+          </w:rPr>
+        </w:r>
+        <w:r>
+          <w:rPr>
+            <w:noProof/>
+            <w:webHidden/>
+          </w:rPr>
+          <w:fldChar w:fldCharType="separate"/>
+        </w:r>
+        <w:r>
+          <w:rPr>
+            <w:noProof/>
+            <w:webHidden/>
+          </w:rPr>
+          <w:t>7</w:t>
+        </w:r>
+        <w:r>
+          <w:rPr>
+            <w:noProof/>
+            <w:webHidden/>
+          </w:rPr>
+          <w:fldChar w:fldCharType="end"/>
+        </w:r>
+      </w:hyperlink>
+    </w:p>
+    <w:p>
+      <w:pPr>
+        <w:pStyle w:val="Tabladeilustraciones"/>
+        <w:tabs>
+          <w:tab w:val="right" w:leader="dot" w:pos="9020"/>
+        </w:tabs>
+        <w:rPr>
+          <w:rFonts w:asciiTheme="minorHAnsi" w:eastAsiaTheme="minorEastAsia" w:hAnsiTheme="minorHAnsi" w:cstheme="minorBidi"/>
+          <w:noProof/>
+          <w:sz w:val="22"/>
+          <w:lang w:val="es-MX" w:eastAsia="es-MX"/>
+        </w:rPr>
+      </w:pPr>
+      <w:hyperlink w:anchor="_Toc243988551" w:history="1">
+        <w:r>
+          <w:rPr>
+            <w:rStyle w:val="Hipervnculo"/>
+            <w:noProof/>
+          </w:rPr>
+          <w:t>Tabla 12. ECUD — CU-01: Autenticarse</w:t>
+        </w:r>
+        <w:r>
+          <w:rPr>
+            <w:noProof/>
+            <w:webHidden/>
+          </w:rPr>
+          <w:tab/>
+        </w:r>
+        <w:r>
+          <w:rPr>
+            <w:noProof/>
+            <w:webHidden/>
+          </w:rPr>
+          <w:fldChar w:fldCharType="begin"/>
+        </w:r>
+        <w:r>
+          <w:rPr>
+            <w:noProof/>
+            <w:webHidden/>
+          </w:rPr>
+          <w:instrText xml:space="preserve"> PAGEREF _Toc243988551 \h </w:instrText>
+        </w:r>
+        <w:r>
+          <w:rPr>
+            <w:noProof/>
+            <w:webHidden/>
+          </w:rPr>
+        </w:r>
+        <w:r>
+          <w:rPr>
+            <w:noProof/>
+            <w:webHidden/>
+          </w:rPr>
+          <w:fldChar w:fldCharType="separate"/>
+        </w:r>
+        <w:r>
+          <w:rPr>
+            <w:noProof/>
+            <w:webHidden/>
+          </w:rPr>
+          <w:t>7</w:t>
+        </w:r>
+        <w:r>
+          <w:rPr>
+            <w:noProof/>
+            <w:webHidden/>
+          </w:rPr>
+          <w:fldChar w:fldCharType="end"/>
+        </w:r>
+      </w:hyperlink>
+    </w:p>
+    <w:p>
+      <w:pPr>
+        <w:pStyle w:val="Tabladeilustraciones"/>
+        <w:tabs>
+          <w:tab w:val="right" w:leader="dot" w:pos="9020"/>
+        </w:tabs>
+        <w:rPr>
+          <w:rFonts w:asciiTheme="minorHAnsi" w:eastAsiaTheme="minorEastAsia" w:hAnsiTheme="minorHAnsi" w:cstheme="minorBidi"/>
+          <w:noProof/>
+          <w:sz w:val="22"/>
+          <w:lang w:val="es-MX" w:eastAsia="es-MX"/>
+        </w:rPr>
+      </w:pPr>
+      <w:hyperlink w:anchor="_Toc243988552" w:history="1">
+        <w:r>
+          <w:rPr>
+            <w:rStyle w:val="Hipervnculo"/>
+            <w:noProof/>
+          </w:rPr>
+          <w:t>Tabla 13. Flujo básico — Autenticarse</w:t>
+        </w:r>
+        <w:r>
+          <w:rPr>
+            <w:noProof/>
+            <w:webHidden/>
+          </w:rPr>
+          <w:tab/>
+        </w:r>
+        <w:r>
+          <w:rPr>
+            <w:noProof/>
+            <w:webHidden/>
+          </w:rPr>
+          <w:fldChar w:fldCharType="begin"/>
+        </w:r>
+        <w:r>
+          <w:rPr>
+            <w:noProof/>
+            <w:webHidden/>
+          </w:rPr>
+          <w:instrText xml:space="preserve"> PAGEREF _Toc243988552 \h </w:instrText>
         </w:r>
         <w:r>
           <w:rPr>
@@ -7066,32 +8020,6 @@
       </w:hyperlink>
     </w:p>
     <w:p>
-      <w:r>
-        <w:fldChar w:fldCharType="end"/>
-      </w:r>
-    </w:p>
-    <w:p>
-      <w:pPr>
-        <w:spacing w:before="0" w:after="0"/>
-        <w:jc w:val="left"/>
-      </w:pPr>
-      <w:r>
-        <w:br w:type="page"/>
-      </w:r>
-    </w:p>
-    <w:p>
-      <w:pPr>
-        <w:pStyle w:val="TtuloTDC"/>
-      </w:pPr>
-      <w:r>
-        <w:lastRenderedPageBreak/>
-        <w:t>ÍNDICE</w:t>
-      </w:r>
-      <w:r>
-        <w:t xml:space="preserve"> DE TABLAS</w:t>
-      </w:r>
-    </w:p>
-    <w:p>
       <w:pPr>
         <w:pStyle w:val="Tabladeilustraciones"/>
         <w:tabs>
@@ -7104,22 +8032,13 @@
           <w:lang w:val="es-MX" w:eastAsia="es-MX"/>
         </w:rPr>
       </w:pPr>
-      <w:r>
-        <w:fldChar w:fldCharType="begin"/>
-      </w:r>
-      <w:r>
-        <w:instrText xml:space="preserve"> TOC \h \z \c "Tabla" </w:instrText>
-      </w:r>
-      <w:r>
-        <w:fldChar w:fldCharType="separate"/>
-      </w:r>
-      <w:hyperlink w:anchor="_Toc242892570" w:history="1">
+      <w:hyperlink w:anchor="_Toc243988553" w:history="1">
         <w:r>
           <w:rPr>
             <w:rStyle w:val="Hipervnculo"/>
             <w:noProof/>
           </w:rPr>
-          <w:t>Tabla 1. Definiciones</w:t>
+          <w:t>Tabla 14. Flujos alternativos — Autenticarse</w:t>
         </w:r>
         <w:r>
           <w:rPr>
@@ -7140,575 +8059,7 @@
             <w:noProof/>
             <w:webHidden/>
           </w:rPr>
-          <w:instrText xml:space="preserve"> PAGEREF _Toc242892570 \h </w:instrText>
-        </w:r>
-        <w:r>
-          <w:rPr>
-            <w:noProof/>
-            <w:webHidden/>
-          </w:rPr>
-        </w:r>
-        <w:r>
-          <w:rPr>
-            <w:noProof/>
-            <w:webHidden/>
-          </w:rPr>
-          <w:fldChar w:fldCharType="separate"/>
-        </w:r>
-        <w:r>
-          <w:rPr>
-            <w:noProof/>
-            <w:webHidden/>
-          </w:rPr>
-          <w:t>5</w:t>
-        </w:r>
-        <w:r>
-          <w:rPr>
-            <w:noProof/>
-            <w:webHidden/>
-          </w:rPr>
-          <w:fldChar w:fldCharType="end"/>
-        </w:r>
-      </w:hyperlink>
-    </w:p>
-    <w:p>
-      <w:pPr>
-        <w:pStyle w:val="Tabladeilustraciones"/>
-        <w:tabs>
-          <w:tab w:val="right" w:leader="dot" w:pos="9020"/>
-        </w:tabs>
-        <w:rPr>
-          <w:rFonts w:asciiTheme="minorHAnsi" w:eastAsiaTheme="minorEastAsia" w:hAnsiTheme="minorHAnsi" w:cstheme="minorBidi"/>
-          <w:noProof/>
-          <w:sz w:val="22"/>
-          <w:lang w:val="es-MX" w:eastAsia="es-MX"/>
-        </w:rPr>
-      </w:pPr>
-      <w:hyperlink w:anchor="_Toc242892571" w:history="1">
-        <w:r>
-          <w:rPr>
-            <w:rStyle w:val="Hipervnculo"/>
-            <w:noProof/>
-          </w:rPr>
-          <w:t>Tabla 2. Acrónimos y abreviaturas</w:t>
-        </w:r>
-        <w:r>
-          <w:rPr>
-            <w:noProof/>
-            <w:webHidden/>
-          </w:rPr>
-          <w:tab/>
-        </w:r>
-        <w:r>
-          <w:rPr>
-            <w:noProof/>
-            <w:webHidden/>
-          </w:rPr>
-          <w:fldChar w:fldCharType="begin"/>
-        </w:r>
-        <w:r>
-          <w:rPr>
-            <w:noProof/>
-            <w:webHidden/>
-          </w:rPr>
-          <w:instrText xml:space="preserve"> PAGEREF _Toc242892571 \h </w:instrText>
-        </w:r>
-        <w:r>
-          <w:rPr>
-            <w:noProof/>
-            <w:webHidden/>
-          </w:rPr>
-        </w:r>
-        <w:r>
-          <w:rPr>
-            <w:noProof/>
-            <w:webHidden/>
-          </w:rPr>
-          <w:fldChar w:fldCharType="separate"/>
-        </w:r>
-        <w:r>
-          <w:rPr>
-            <w:noProof/>
-            <w:webHidden/>
-          </w:rPr>
-          <w:t>6</w:t>
-        </w:r>
-        <w:r>
-          <w:rPr>
-            <w:noProof/>
-            <w:webHidden/>
-          </w:rPr>
-          <w:fldChar w:fldCharType="end"/>
-        </w:r>
-      </w:hyperlink>
-    </w:p>
-    <w:p>
-      <w:pPr>
-        <w:pStyle w:val="Tabladeilustraciones"/>
-        <w:tabs>
-          <w:tab w:val="right" w:leader="dot" w:pos="9020"/>
-        </w:tabs>
-        <w:rPr>
-          <w:rFonts w:asciiTheme="minorHAnsi" w:eastAsiaTheme="minorEastAsia" w:hAnsiTheme="minorHAnsi" w:cstheme="minorBidi"/>
-          <w:noProof/>
-          <w:sz w:val="22"/>
-          <w:lang w:val="es-MX" w:eastAsia="es-MX"/>
-        </w:rPr>
-      </w:pPr>
-      <w:hyperlink w:anchor="_Toc242892572" w:history="1">
-        <w:r>
-          <w:rPr>
-            <w:rStyle w:val="Hipervnculo"/>
-            <w:noProof/>
-          </w:rPr>
-          <w:t>Tabla 3. Referencias</w:t>
-        </w:r>
-        <w:r>
-          <w:rPr>
-            <w:noProof/>
-            <w:webHidden/>
-          </w:rPr>
-          <w:tab/>
-        </w:r>
-        <w:r>
-          <w:rPr>
-            <w:noProof/>
-            <w:webHidden/>
-          </w:rPr>
-          <w:fldChar w:fldCharType="begin"/>
-        </w:r>
-        <w:r>
-          <w:rPr>
-            <w:noProof/>
-            <w:webHidden/>
-          </w:rPr>
-          <w:instrText xml:space="preserve"> PAGEREF _Toc242892572 \h </w:instrText>
-        </w:r>
-        <w:r>
-          <w:rPr>
-            <w:noProof/>
-            <w:webHidden/>
-          </w:rPr>
-        </w:r>
-        <w:r>
-          <w:rPr>
-            <w:noProof/>
-            <w:webHidden/>
-          </w:rPr>
-          <w:fldChar w:fldCharType="separate"/>
-        </w:r>
-        <w:r>
-          <w:rPr>
-            <w:noProof/>
-            <w:webHidden/>
-          </w:rPr>
-          <w:t>6</w:t>
-        </w:r>
-        <w:r>
-          <w:rPr>
-            <w:noProof/>
-            <w:webHidden/>
-          </w:rPr>
-          <w:fldChar w:fldCharType="end"/>
-        </w:r>
-      </w:hyperlink>
-    </w:p>
-    <w:p>
-      <w:pPr>
-        <w:pStyle w:val="Tabladeilustraciones"/>
-        <w:tabs>
-          <w:tab w:val="right" w:leader="dot" w:pos="9020"/>
-        </w:tabs>
-        <w:rPr>
-          <w:rFonts w:asciiTheme="minorHAnsi" w:eastAsiaTheme="minorEastAsia" w:hAnsiTheme="minorHAnsi" w:cstheme="minorBidi"/>
-          <w:noProof/>
-          <w:sz w:val="22"/>
-          <w:lang w:val="es-MX" w:eastAsia="es-MX"/>
-        </w:rPr>
-      </w:pPr>
-      <w:hyperlink w:anchor="_Toc242892573" w:history="1">
-        <w:r>
-          <w:rPr>
-            <w:rStyle w:val="Hipervnculo"/>
-            <w:noProof/>
-          </w:rPr>
-          <w:t>Tabla 4. Actor Usuario</w:t>
-        </w:r>
-        <w:r>
-          <w:rPr>
-            <w:noProof/>
-            <w:webHidden/>
-          </w:rPr>
-          <w:tab/>
-        </w:r>
-        <w:r>
-          <w:rPr>
-            <w:noProof/>
-            <w:webHidden/>
-          </w:rPr>
-          <w:fldChar w:fldCharType="begin"/>
-        </w:r>
-        <w:r>
-          <w:rPr>
-            <w:noProof/>
-            <w:webHidden/>
-          </w:rPr>
-          <w:instrText xml:space="preserve"> PAGEREF _Toc242892573 \h </w:instrText>
-        </w:r>
-        <w:r>
-          <w:rPr>
-            <w:noProof/>
-            <w:webHidden/>
-          </w:rPr>
-        </w:r>
-        <w:r>
-          <w:rPr>
-            <w:noProof/>
-            <w:webHidden/>
-          </w:rPr>
-          <w:fldChar w:fldCharType="separate"/>
-        </w:r>
-        <w:r>
-          <w:rPr>
-            <w:noProof/>
-            <w:webHidden/>
-          </w:rPr>
-          <w:t>6</w:t>
-        </w:r>
-        <w:r>
-          <w:rPr>
-            <w:noProof/>
-            <w:webHidden/>
-          </w:rPr>
-          <w:fldChar w:fldCharType="end"/>
-        </w:r>
-      </w:hyperlink>
-    </w:p>
-    <w:p>
-      <w:pPr>
-        <w:pStyle w:val="Tabladeilustraciones"/>
-        <w:tabs>
-          <w:tab w:val="right" w:leader="dot" w:pos="9020"/>
-        </w:tabs>
-        <w:rPr>
-          <w:rFonts w:asciiTheme="minorHAnsi" w:eastAsiaTheme="minorEastAsia" w:hAnsiTheme="minorHAnsi" w:cstheme="minorBidi"/>
-          <w:noProof/>
-          <w:sz w:val="22"/>
-          <w:lang w:val="es-MX" w:eastAsia="es-MX"/>
-        </w:rPr>
-      </w:pPr>
-      <w:hyperlink w:anchor="_Toc242892574" w:history="1">
-        <w:r>
-          <w:rPr>
-            <w:rStyle w:val="Hipervnculo"/>
-            <w:noProof/>
-          </w:rPr>
-          <w:t>Tabla 5. Actor Cliente Consola</w:t>
-        </w:r>
-        <w:r>
-          <w:rPr>
-            <w:noProof/>
-            <w:webHidden/>
-          </w:rPr>
-          <w:tab/>
-        </w:r>
-        <w:r>
-          <w:rPr>
-            <w:noProof/>
-            <w:webHidden/>
-          </w:rPr>
-          <w:fldChar w:fldCharType="begin"/>
-        </w:r>
-        <w:r>
-          <w:rPr>
-            <w:noProof/>
-            <w:webHidden/>
-          </w:rPr>
-          <w:instrText xml:space="preserve"> PAGEREF _Toc242892574 \h </w:instrText>
-        </w:r>
-        <w:r>
-          <w:rPr>
-            <w:noProof/>
-            <w:webHidden/>
-          </w:rPr>
-        </w:r>
-        <w:r>
-          <w:rPr>
-            <w:noProof/>
-            <w:webHidden/>
-          </w:rPr>
-          <w:fldChar w:fldCharType="separate"/>
-        </w:r>
-        <w:r>
-          <w:rPr>
-            <w:noProof/>
-            <w:webHidden/>
-          </w:rPr>
-          <w:t>7</w:t>
-        </w:r>
-        <w:r>
-          <w:rPr>
-            <w:noProof/>
-            <w:webHidden/>
-          </w:rPr>
-          <w:fldChar w:fldCharType="end"/>
-        </w:r>
-      </w:hyperlink>
-    </w:p>
-    <w:p>
-      <w:pPr>
-        <w:pStyle w:val="Tabladeilustraciones"/>
-        <w:tabs>
-          <w:tab w:val="right" w:leader="dot" w:pos="9020"/>
-        </w:tabs>
-        <w:rPr>
-          <w:rFonts w:asciiTheme="minorHAnsi" w:eastAsiaTheme="minorEastAsia" w:hAnsiTheme="minorHAnsi" w:cstheme="minorBidi"/>
-          <w:noProof/>
-          <w:sz w:val="22"/>
-          <w:lang w:val="es-MX" w:eastAsia="es-MX"/>
-        </w:rPr>
-      </w:pPr>
-      <w:hyperlink w:anchor="_Toc242892575" w:history="1">
-        <w:r>
-          <w:rPr>
-            <w:rStyle w:val="Hipervnculo"/>
-            <w:noProof/>
-          </w:rPr>
-          <w:t>Tabla 6. Actor Cliente Escritorio</w:t>
-        </w:r>
-        <w:r>
-          <w:rPr>
-            <w:noProof/>
-            <w:webHidden/>
-          </w:rPr>
-          <w:tab/>
-        </w:r>
-        <w:r>
-          <w:rPr>
-            <w:noProof/>
-            <w:webHidden/>
-          </w:rPr>
-          <w:fldChar w:fldCharType="begin"/>
-        </w:r>
-        <w:r>
-          <w:rPr>
-            <w:noProof/>
-            <w:webHidden/>
-          </w:rPr>
-          <w:instrText xml:space="preserve"> PAGEREF _Toc242892575 \h </w:instrText>
-        </w:r>
-        <w:r>
-          <w:rPr>
-            <w:noProof/>
-            <w:webHidden/>
-          </w:rPr>
-        </w:r>
-        <w:r>
-          <w:rPr>
-            <w:noProof/>
-            <w:webHidden/>
-          </w:rPr>
-          <w:fldChar w:fldCharType="separate"/>
-        </w:r>
-        <w:r>
-          <w:rPr>
-            <w:noProof/>
-            <w:webHidden/>
-          </w:rPr>
-          <w:t>7</w:t>
-        </w:r>
-        <w:r>
-          <w:rPr>
-            <w:noProof/>
-            <w:webHidden/>
-          </w:rPr>
-          <w:fldChar w:fldCharType="end"/>
-        </w:r>
-      </w:hyperlink>
-    </w:p>
-    <w:p>
-      <w:pPr>
-        <w:pStyle w:val="Tabladeilustraciones"/>
-        <w:tabs>
-          <w:tab w:val="right" w:leader="dot" w:pos="9020"/>
-        </w:tabs>
-        <w:rPr>
-          <w:rFonts w:asciiTheme="minorHAnsi" w:eastAsiaTheme="minorEastAsia" w:hAnsiTheme="minorHAnsi" w:cstheme="minorBidi"/>
-          <w:noProof/>
-          <w:sz w:val="22"/>
-          <w:lang w:val="es-MX" w:eastAsia="es-MX"/>
-        </w:rPr>
-      </w:pPr>
-      <w:hyperlink w:anchor="_Toc242892576" w:history="1">
-        <w:r>
-          <w:rPr>
-            <w:rStyle w:val="Hipervnculo"/>
-            <w:noProof/>
-          </w:rPr>
-          <w:t>Tabla 7. Actor Cliente Web</w:t>
-        </w:r>
-        <w:r>
-          <w:rPr>
-            <w:noProof/>
-            <w:webHidden/>
-          </w:rPr>
-          <w:tab/>
-        </w:r>
-        <w:r>
-          <w:rPr>
-            <w:noProof/>
-            <w:webHidden/>
-          </w:rPr>
-          <w:fldChar w:fldCharType="begin"/>
-        </w:r>
-        <w:r>
-          <w:rPr>
-            <w:noProof/>
-            <w:webHidden/>
-          </w:rPr>
-          <w:instrText xml:space="preserve"> PAGEREF _Toc242892576 \h </w:instrText>
-        </w:r>
-        <w:r>
-          <w:rPr>
-            <w:noProof/>
-            <w:webHidden/>
-          </w:rPr>
-        </w:r>
-        <w:r>
-          <w:rPr>
-            <w:noProof/>
-            <w:webHidden/>
-          </w:rPr>
-          <w:fldChar w:fldCharType="separate"/>
-        </w:r>
-        <w:r>
-          <w:rPr>
-            <w:noProof/>
-            <w:webHidden/>
-          </w:rPr>
-          <w:t>7</w:t>
-        </w:r>
-        <w:r>
-          <w:rPr>
-            <w:noProof/>
-            <w:webHidden/>
-          </w:rPr>
-          <w:fldChar w:fldCharType="end"/>
-        </w:r>
-      </w:hyperlink>
-    </w:p>
-    <w:p>
-      <w:pPr>
-        <w:pStyle w:val="Tabladeilustraciones"/>
-        <w:tabs>
-          <w:tab w:val="right" w:leader="dot" w:pos="9020"/>
-        </w:tabs>
-        <w:rPr>
-          <w:rFonts w:asciiTheme="minorHAnsi" w:eastAsiaTheme="minorEastAsia" w:hAnsiTheme="minorHAnsi" w:cstheme="minorBidi"/>
-          <w:noProof/>
-          <w:sz w:val="22"/>
-          <w:lang w:val="es-MX" w:eastAsia="es-MX"/>
-        </w:rPr>
-      </w:pPr>
-      <w:hyperlink w:anchor="_Toc242892577" w:history="1">
-        <w:r>
-          <w:rPr>
-            <w:rStyle w:val="Hipervnculo"/>
-            <w:noProof/>
-          </w:rPr>
-          <w:t>Tabla 8. Actor Cliente Móvil Android</w:t>
-        </w:r>
-        <w:r>
-          <w:rPr>
-            <w:noProof/>
-            <w:webHidden/>
-          </w:rPr>
-          <w:tab/>
-        </w:r>
-        <w:r>
-          <w:rPr>
-            <w:noProof/>
-            <w:webHidden/>
-          </w:rPr>
-          <w:fldChar w:fldCharType="begin"/>
-        </w:r>
-        <w:r>
-          <w:rPr>
-            <w:noProof/>
-            <w:webHidden/>
-          </w:rPr>
-          <w:instrText xml:space="preserve"> PAGEREF _Toc242892577 \h </w:instrText>
-        </w:r>
-        <w:r>
-          <w:rPr>
-            <w:noProof/>
-            <w:webHidden/>
-          </w:rPr>
-        </w:r>
-        <w:r>
-          <w:rPr>
-            <w:noProof/>
-            <w:webHidden/>
-          </w:rPr>
-          <w:fldChar w:fldCharType="separate"/>
-        </w:r>
-        <w:r>
-          <w:rPr>
-            <w:noProof/>
-            <w:webHidden/>
-          </w:rPr>
-          <w:t>7</w:t>
-        </w:r>
-        <w:r>
-          <w:rPr>
-            <w:noProof/>
-            <w:webHidden/>
-          </w:rPr>
-          <w:fldChar w:fldCharType="end"/>
-        </w:r>
-      </w:hyperlink>
-    </w:p>
-    <w:p>
-      <w:pPr>
-        <w:pStyle w:val="Tabladeilustraciones"/>
-        <w:tabs>
-          <w:tab w:val="right" w:leader="dot" w:pos="9020"/>
-        </w:tabs>
-        <w:rPr>
-          <w:rFonts w:asciiTheme="minorHAnsi" w:eastAsiaTheme="minorEastAsia" w:hAnsiTheme="minorHAnsi" w:cstheme="minorBidi"/>
-          <w:noProof/>
-          <w:sz w:val="22"/>
-          <w:lang w:val="es-MX" w:eastAsia="es-MX"/>
-        </w:rPr>
-      </w:pPr>
-      <w:hyperlink w:anchor="_Toc242892578" w:history="1">
-        <w:r>
-          <w:rPr>
-            <w:rStyle w:val="Hipervnculo"/>
-            <w:noProof/>
-          </w:rPr>
-          <w:t>Tabla 9. Lista de casos de uso</w:t>
-        </w:r>
-        <w:r>
-          <w:rPr>
-            <w:noProof/>
-            <w:webHidden/>
-          </w:rPr>
-          <w:tab/>
-        </w:r>
-        <w:r>
-          <w:rPr>
-            <w:noProof/>
-            <w:webHidden/>
-          </w:rPr>
-          <w:fldChar w:fldCharType="begin"/>
-        </w:r>
-        <w:r>
-          <w:rPr>
-            <w:noProof/>
-            <w:webHidden/>
-          </w:rPr>
-          <w:instrText xml:space="preserve"> PAGEREF _Toc242892578 \h </w:instrText>
+          <w:instrText xml:space="preserve"> PAGEREF _Toc243988553 \h </w:instrText>
         </w:r>
         <w:r>
           <w:rPr>
@@ -7752,13 +8103,13 @@
           <w:lang w:val="es-MX" w:eastAsia="es-MX"/>
         </w:rPr>
       </w:pPr>
-      <w:hyperlink w:anchor="_Toc242892579" w:history="1">
+      <w:hyperlink w:anchor="_Toc243988554" w:history="1">
         <w:r>
           <w:rPr>
             <w:rStyle w:val="Hipervnculo"/>
             <w:noProof/>
           </w:rPr>
-          <w:t>Tabla 10. Campos de la respuesta estructurada</w:t>
+          <w:t>Tabla 15. ECUD — CU-02: Consultar catálogo</w:t>
         </w:r>
         <w:r>
           <w:rPr>
@@ -7779,7 +8130,7 @@
             <w:noProof/>
             <w:webHidden/>
           </w:rPr>
-          <w:instrText xml:space="preserve"> PAGEREF _Toc242892579 \h </w:instrText>
+          <w:instrText xml:space="preserve"> PAGEREF _Toc243988554 \h </w:instrText>
         </w:r>
         <w:r>
           <w:rPr>
@@ -7823,13 +8174,13 @@
           <w:lang w:val="es-MX" w:eastAsia="es-MX"/>
         </w:rPr>
       </w:pPr>
-      <w:hyperlink w:anchor="_Toc242892580" w:history="1">
+      <w:hyperlink w:anchor="_Toc243988555" w:history="1">
         <w:r>
           <w:rPr>
             <w:rStyle w:val="Hipervnculo"/>
             <w:noProof/>
           </w:rPr>
-          <w:t>Tabla 11. Códigos de resultado</w:t>
+          <w:t>Tabla 16. Flujo básico — Consultar catálogo</w:t>
         </w:r>
         <w:r>
           <w:rPr>
@@ -7850,7 +8201,78 @@
             <w:noProof/>
             <w:webHidden/>
           </w:rPr>
-          <w:instrText xml:space="preserve"> PAGEREF _Toc242892580 \h </w:instrText>
+          <w:instrText xml:space="preserve"> PAGEREF _Toc243988555 \h </w:instrText>
+        </w:r>
+        <w:r>
+          <w:rPr>
+            <w:noProof/>
+            <w:webHidden/>
+          </w:rPr>
+        </w:r>
+        <w:r>
+          <w:rPr>
+            <w:noProof/>
+            <w:webHidden/>
+          </w:rPr>
+          <w:fldChar w:fldCharType="separate"/>
+        </w:r>
+        <w:r>
+          <w:rPr>
+            <w:noProof/>
+            <w:webHidden/>
+          </w:rPr>
+          <w:t>8</w:t>
+        </w:r>
+        <w:r>
+          <w:rPr>
+            <w:noProof/>
+            <w:webHidden/>
+          </w:rPr>
+          <w:fldChar w:fldCharType="end"/>
+        </w:r>
+      </w:hyperlink>
+    </w:p>
+    <w:p>
+      <w:pPr>
+        <w:pStyle w:val="Tabladeilustraciones"/>
+        <w:tabs>
+          <w:tab w:val="right" w:leader="dot" w:pos="9020"/>
+        </w:tabs>
+        <w:rPr>
+          <w:rFonts w:asciiTheme="minorHAnsi" w:eastAsiaTheme="minorEastAsia" w:hAnsiTheme="minorHAnsi" w:cstheme="minorBidi"/>
+          <w:noProof/>
+          <w:sz w:val="22"/>
+          <w:lang w:val="es-MX" w:eastAsia="es-MX"/>
+        </w:rPr>
+      </w:pPr>
+      <w:hyperlink w:anchor="_Toc243988556" w:history="1">
+        <w:r>
+          <w:rPr>
+            <w:rStyle w:val="Hipervnculo"/>
+            <w:noProof/>
+          </w:rPr>
+          <w:t>Tabla 17. Flujos alternativos — Consultar catálogo</w:t>
+        </w:r>
+        <w:r>
+          <w:rPr>
+            <w:noProof/>
+            <w:webHidden/>
+          </w:rPr>
+          <w:tab/>
+        </w:r>
+        <w:r>
+          <w:rPr>
+            <w:noProof/>
+            <w:webHidden/>
+          </w:rPr>
+          <w:fldChar w:fldCharType="begin"/>
+        </w:r>
+        <w:r>
+          <w:rPr>
+            <w:noProof/>
+            <w:webHidden/>
+          </w:rPr>
+          <w:instrText xml:space="preserve"> PAGEREF _Toc243988556 \h </w:instrText>
         </w:r>
         <w:r>
           <w:rPr>
@@ -7894,13 +8316,13 @@
           <w:lang w:val="es-MX" w:eastAsia="es-MX"/>
         </w:rPr>
       </w:pPr>
-      <w:hyperlink w:anchor="_Toc242892581" w:history="1">
+      <w:hyperlink w:anchor="_Toc243988557" w:history="1">
         <w:r>
           <w:rPr>
             <w:rStyle w:val="Hipervnculo"/>
             <w:noProof/>
           </w:rPr>
-          <w:t>Tabla 12. ECUD — CU-01: Autenticarse</w:t>
+          <w:t>Tabla 18. ECUD — CU-03: Consultar unidades por categoría</w:t>
         </w:r>
         <w:r>
           <w:rPr>
@@ -7921,7 +8343,7 @@
             <w:noProof/>
             <w:webHidden/>
           </w:rPr>
-          <w:instrText xml:space="preserve"> PAGEREF _Toc242892581 \h </w:instrText>
+          <w:instrText xml:space="preserve"> PAGEREF _Toc243988557 \h </w:instrText>
         </w:r>
         <w:r>
           <w:rPr>
@@ -7965,13 +8387,13 @@
           <w:lang w:val="es-MX" w:eastAsia="es-MX"/>
         </w:rPr>
       </w:pPr>
-      <w:hyperlink w:anchor="_Toc242892582" w:history="1">
+      <w:hyperlink w:anchor="_Toc243988558" w:history="1">
         <w:r>
           <w:rPr>
             <w:rStyle w:val="Hipervnculo"/>
             <w:noProof/>
           </w:rPr>
-          <w:t>Tabla 13. Flujo básico — Autenticarse</w:t>
+          <w:t>Tabla 19. Flujo básico — Consultar unidades por categoría</w:t>
         </w:r>
         <w:r>
           <w:rPr>
@@ -7992,7 +8414,7 @@
             <w:noProof/>
             <w:webHidden/>
           </w:rPr>
-          <w:instrText xml:space="preserve"> PAGEREF _Toc242892582 \h </w:instrText>
+          <w:instrText xml:space="preserve"> PAGEREF _Toc243988558 \h </w:instrText>
         </w:r>
         <w:r>
           <w:rPr>
@@ -8036,13 +8458,13 @@
           <w:lang w:val="es-MX" w:eastAsia="es-MX"/>
         </w:rPr>
       </w:pPr>
-      <w:hyperlink w:anchor="_Toc242892583" w:history="1">
+      <w:hyperlink w:anchor="_Toc243988559" w:history="1">
         <w:r>
           <w:rPr>
             <w:rStyle w:val="Hipervnculo"/>
             <w:noProof/>
           </w:rPr>
-          <w:t>Tabla 14. Flujos alternativos — Autenticarse</w:t>
+          <w:t>Tabla 20. Flujos alternativos — Consultar unidades por categoría</w:t>
         </w:r>
         <w:r>
           <w:rPr>
@@ -8063,7 +8485,7 @@
             <w:noProof/>
             <w:webHidden/>
           </w:rPr>
-          <w:instrText xml:space="preserve"> PAGEREF _Toc242892583 \h </w:instrText>
+          <w:instrText xml:space="preserve"> PAGEREF _Toc243988559 \h </w:instrText>
         </w:r>
         <w:r>
           <w:rPr>
@@ -8107,13 +8529,13 @@
           <w:lang w:val="es-MX" w:eastAsia="es-MX"/>
         </w:rPr>
       </w:pPr>
-      <w:hyperlink w:anchor="_Toc242892584" w:history="1">
+      <w:hyperlink w:anchor="_Toc243988560" w:history="1">
         <w:r>
           <w:rPr>
             <w:rStyle w:val="Hipervnculo"/>
             <w:noProof/>
           </w:rPr>
-          <w:t>Tabla 15. ECUD — CU-02: Consultar catálogo</w:t>
+          <w:t>Tabla 21. ECUD — CU-04: Realizar conversión</w:t>
         </w:r>
         <w:r>
           <w:rPr>
@@ -8134,7 +8556,7 @@
             <w:noProof/>
             <w:webHidden/>
           </w:rPr>
-          <w:instrText xml:space="preserve"> PAGEREF _Toc242892584 \h </w:instrText>
+          <w:instrText xml:space="preserve"> PAGEREF _Toc243988560 \h </w:instrText>
         </w:r>
         <w:r>
           <w:rPr>
@@ -8178,13 +8600,13 @@
           <w:lang w:val="es-MX" w:eastAsia="es-MX"/>
         </w:rPr>
       </w:pPr>
-      <w:hyperlink w:anchor="_Toc242892585" w:history="1">
+      <w:hyperlink w:anchor="_Toc243988561" w:history="1">
         <w:r>
           <w:rPr>
             <w:rStyle w:val="Hipervnculo"/>
             <w:noProof/>
           </w:rPr>
-          <w:t>Tabla 16. Flujo básico — Consultar catálogo</w:t>
+          <w:t>Tabla 22. Flujo básico — Realizar conversión</w:t>
         </w:r>
         <w:r>
           <w:rPr>
@@ -8205,7 +8627,7 @@
             <w:noProof/>
             <w:webHidden/>
           </w:rPr>
-          <w:instrText xml:space="preserve"> PAGEREF _Toc242892585 \h </w:instrText>
+          <w:instrText xml:space="preserve"> PAGEREF _Toc243988561 \h </w:instrText>
         </w:r>
         <w:r>
           <w:rPr>
@@ -8249,13 +8671,13 @@
           <w:lang w:val="es-MX" w:eastAsia="es-MX"/>
         </w:rPr>
       </w:pPr>
-      <w:hyperlink w:anchor="_Toc242892586" w:history="1">
+      <w:hyperlink w:anchor="_Toc243988562" w:history="1">
         <w:r>
           <w:rPr>
             <w:rStyle w:val="Hipervnculo"/>
             <w:noProof/>
           </w:rPr>
-          <w:t>Tabla 17. Flujos alternativos — Consultar catálogo</w:t>
+          <w:t>Tabla 23. Flujos alternativos — Realizar conversión</w:t>
         </w:r>
         <w:r>
           <w:rPr>
@@ -8276,7 +8698,7 @@
             <w:noProof/>
             <w:webHidden/>
           </w:rPr>
-          <w:instrText xml:space="preserve"> PAGEREF _Toc242892586 \h </w:instrText>
+          <w:instrText xml:space="preserve"> PAGEREF _Toc243988562 \h </w:instrText>
         </w:r>
         <w:r>
           <w:rPr>
@@ -8320,13 +8742,13 @@
           <w:lang w:val="es-MX" w:eastAsia="es-MX"/>
         </w:rPr>
       </w:pPr>
-      <w:hyperlink w:anchor="_Toc242892587" w:history="1">
+      <w:hyperlink w:anchor="_Toc243988563" w:history="1">
         <w:r>
           <w:rPr>
             <w:rStyle w:val="Hipervnculo"/>
             <w:noProof/>
           </w:rPr>
-          <w:t>Tabla 18. ECUD — CU-03: Consultar unidades por categoría</w:t>
+          <w:t>Tabla 24. Reglas de conversión de CU-04</w:t>
         </w:r>
         <w:r>
           <w:rPr>
@@ -8347,7 +8769,7 @@
             <w:noProof/>
             <w:webHidden/>
           </w:rPr>
-          <w:instrText xml:space="preserve"> PAGEREF _Toc242892587 \h </w:instrText>
+          <w:instrText xml:space="preserve"> PAGEREF _Toc243988563 \h </w:instrText>
         </w:r>
         <w:r>
           <w:rPr>
@@ -8391,13 +8813,13 @@
           <w:lang w:val="es-MX" w:eastAsia="es-MX"/>
         </w:rPr>
       </w:pPr>
-      <w:hyperlink w:anchor="_Toc242892588" w:history="1">
+      <w:hyperlink w:anchor="_Toc243988564" w:history="1">
         <w:r>
           <w:rPr>
             <w:rStyle w:val="Hipervnculo"/>
             <w:noProof/>
           </w:rPr>
-          <w:t>Tabla 19. Flujo básico — Consultar unidades por categoría</w:t>
+          <w:t>Tabla 25. ECUD — CU-05: Validar token</w:t>
         </w:r>
         <w:r>
           <w:rPr>
@@ -8418,7 +8840,7 @@
             <w:noProof/>
             <w:webHidden/>
           </w:rPr>
-          <w:instrText xml:space="preserve"> PAGEREF _Toc242892588 \h </w:instrText>
+          <w:instrText xml:space="preserve"> PAGEREF _Toc243988564 \h </w:instrText>
         </w:r>
         <w:r>
           <w:rPr>
@@ -8462,13 +8884,13 @@
           <w:lang w:val="es-MX" w:eastAsia="es-MX"/>
         </w:rPr>
       </w:pPr>
-      <w:hyperlink w:anchor="_Toc242892589" w:history="1">
+      <w:hyperlink w:anchor="_Toc243988565" w:history="1">
         <w:r>
           <w:rPr>
             <w:rStyle w:val="Hipervnculo"/>
             <w:noProof/>
           </w:rPr>
-          <w:t>Tabla 20. Flujos alternativos — Consultar unidades por categoría</w:t>
+          <w:t>Tabla 26. Flujo básico — Validar token</w:t>
         </w:r>
         <w:r>
           <w:rPr>
@@ -8489,7 +8911,7 @@
             <w:noProof/>
             <w:webHidden/>
           </w:rPr>
-          <w:instrText xml:space="preserve"> PAGEREF _Toc242892589 \h </w:instrText>
+          <w:instrText xml:space="preserve"> PAGEREF _Toc243988565 \h </w:instrText>
         </w:r>
         <w:r>
           <w:rPr>
@@ -8533,13 +8955,13 @@
           <w:lang w:val="es-MX" w:eastAsia="es-MX"/>
         </w:rPr>
       </w:pPr>
-      <w:hyperlink w:anchor="_Toc242892590" w:history="1">
+      <w:hyperlink w:anchor="_Toc243988566" w:history="1">
         <w:r>
           <w:rPr>
             <w:rStyle w:val="Hipervnculo"/>
             <w:noProof/>
           </w:rPr>
-          <w:t>Tabla 21. ECUD — CU-04: Realizar conversión</w:t>
+          <w:t>Tabla 27. Flujos alternativos — Validar token</w:t>
         </w:r>
         <w:r>
           <w:rPr>
@@ -8560,7 +8982,7 @@
             <w:noProof/>
             <w:webHidden/>
           </w:rPr>
-          <w:instrText xml:space="preserve"> PAGEREF _Toc242892590 \h </w:instrText>
+          <w:instrText xml:space="preserve"> PAGEREF _Toc243988566 \h </w:instrText>
         </w:r>
         <w:r>
           <w:rPr>
@@ -8604,13 +9026,13 @@
           <w:lang w:val="es-MX" w:eastAsia="es-MX"/>
         </w:rPr>
       </w:pPr>
-      <w:hyperlink w:anchor="_Toc242892591" w:history="1">
+      <w:hyperlink w:anchor="_Toc243988567" w:history="1">
         <w:r>
           <w:rPr>
             <w:rStyle w:val="Hipervnculo"/>
             <w:noProof/>
           </w:rPr>
-          <w:t>Tabla 22. Flujo básico — Realizar conversión</w:t>
+          <w:t>Tabla 28. ECUD — CU-06: Validar datos de conversión</w:t>
         </w:r>
         <w:r>
           <w:rPr>
@@ -8631,7 +9053,7 @@
             <w:noProof/>
             <w:webHidden/>
           </w:rPr>
-          <w:instrText xml:space="preserve"> PAGEREF _Toc242892591 \h </w:instrText>
+          <w:instrText xml:space="preserve"> PAGEREF _Toc243988567 \h </w:instrText>
         </w:r>
         <w:r>
           <w:rPr>
@@ -8675,13 +9097,13 @@
           <w:lang w:val="es-MX" w:eastAsia="es-MX"/>
         </w:rPr>
       </w:pPr>
-      <w:hyperlink w:anchor="_Toc242892592" w:history="1">
+      <w:hyperlink w:anchor="_Toc243988568" w:history="1">
         <w:r>
           <w:rPr>
             <w:rStyle w:val="Hipervnculo"/>
             <w:noProof/>
           </w:rPr>
-          <w:t>Tabla 23. Flujos alternativos — Realizar conversión</w:t>
+          <w:t>Tabla 29. Flujo básico — Validar datos de conversión</w:t>
         </w:r>
         <w:r>
           <w:rPr>
@@ -8702,7 +9124,7 @@
             <w:noProof/>
             <w:webHidden/>
           </w:rPr>
-          <w:instrText xml:space="preserve"> PAGEREF _Toc242892592 \h </w:instrText>
+          <w:instrText xml:space="preserve"> PAGEREF _Toc243988568 \h </w:instrText>
         </w:r>
         <w:r>
           <w:rPr>
@@ -8746,13 +9168,13 @@
           <w:lang w:val="es-MX" w:eastAsia="es-MX"/>
         </w:rPr>
       </w:pPr>
-      <w:hyperlink w:anchor="_Toc242892593" w:history="1">
+      <w:hyperlink w:anchor="_Toc243988569" w:history="1">
         <w:r>
           <w:rPr>
             <w:rStyle w:val="Hipervnculo"/>
             <w:noProof/>
           </w:rPr>
-          <w:t>Tabla 24. Reglas de conversión de CU-04</w:t>
+          <w:t>Tabla 30. Flujos alternativos — Validar datos de conversión</w:t>
         </w:r>
         <w:r>
           <w:rPr>
@@ -8773,7 +9195,7 @@
             <w:noProof/>
             <w:webHidden/>
           </w:rPr>
-          <w:instrText xml:space="preserve"> PAGEREF _Toc242892593 \h </w:instrText>
+          <w:instrText xml:space="preserve"> PAGEREF _Toc243988569 \h </w:instrText>
         </w:r>
         <w:r>
           <w:rPr>
@@ -8817,13 +9239,13 @@
           <w:lang w:val="es-MX" w:eastAsia="es-MX"/>
         </w:rPr>
       </w:pPr>
-      <w:hyperlink w:anchor="_Toc242892594" w:history="1">
+      <w:hyperlink w:anchor="_Toc243988570" w:history="1">
         <w:r>
           <w:rPr>
             <w:rStyle w:val="Hipervnculo"/>
             <w:noProof/>
           </w:rPr>
-          <w:t>Tabla 25. ECUD — CU-05: Validar token</w:t>
+          <w:t>Tabla 31. ECUD — CU-07: Generar respuesta estructurada</w:t>
         </w:r>
         <w:r>
           <w:rPr>
@@ -8844,7 +9266,7 @@
             <w:noProof/>
             <w:webHidden/>
           </w:rPr>
-          <w:instrText xml:space="preserve"> PAGEREF _Toc242892594 \h </w:instrText>
+          <w:instrText xml:space="preserve"> PAGEREF _Toc243988570 \h </w:instrText>
         </w:r>
         <w:r>
           <w:rPr>
@@ -8888,13 +9310,13 @@
           <w:lang w:val="es-MX" w:eastAsia="es-MX"/>
         </w:rPr>
       </w:pPr>
-      <w:hyperlink w:anchor="_Toc242892595" w:history="1">
+      <w:hyperlink w:anchor="_Toc243988571" w:history="1">
         <w:r>
           <w:rPr>
             <w:rStyle w:val="Hipervnculo"/>
             <w:noProof/>
           </w:rPr>
-          <w:t>Tabla 26. Flujo básico — Validar token</w:t>
+          <w:t>Tabla 32. Flujo básico — Generar respuesta estructurada</w:t>
         </w:r>
         <w:r>
           <w:rPr>
@@ -8915,7 +9337,78 @@
             <w:noProof/>
             <w:webHidden/>
           </w:rPr>
-          <w:instrText xml:space="preserve"> PAGEREF _Toc242892595 \h </w:instrText>
+          <w:instrText xml:space="preserve"> PAGEREF _Toc243988571 \h </w:instrText>
+        </w:r>
+        <w:r>
+          <w:rPr>
+            <w:noProof/>
+            <w:webHidden/>
+          </w:rPr>
+        </w:r>
+        <w:r>
+          <w:rPr>
+            <w:noProof/>
+            <w:webHidden/>
+          </w:rPr>
+          <w:fldChar w:fldCharType="separate"/>
+        </w:r>
+        <w:r>
+          <w:rPr>
+            <w:noProof/>
+            <w:webHidden/>
+          </w:rPr>
+          <w:t>13</w:t>
+        </w:r>
+        <w:r>
+          <w:rPr>
+            <w:noProof/>
+            <w:webHidden/>
+          </w:rPr>
+          <w:fldChar w:fldCharType="end"/>
+        </w:r>
+      </w:hyperlink>
+    </w:p>
+    <w:p>
+      <w:pPr>
+        <w:pStyle w:val="Tabladeilustraciones"/>
+        <w:tabs>
+          <w:tab w:val="right" w:leader="dot" w:pos="9020"/>
+        </w:tabs>
+        <w:rPr>
+          <w:rFonts w:asciiTheme="minorHAnsi" w:eastAsiaTheme="minorEastAsia" w:hAnsiTheme="minorHAnsi" w:cstheme="minorBidi"/>
+          <w:noProof/>
+          <w:sz w:val="22"/>
+          <w:lang w:val="es-MX" w:eastAsia="es-MX"/>
+        </w:rPr>
+      </w:pPr>
+      <w:hyperlink w:anchor="_Toc243988572" w:history="1">
+        <w:r>
+          <w:rPr>
+            <w:rStyle w:val="Hipervnculo"/>
+            <w:noProof/>
+          </w:rPr>
+          <w:t>Tabla 33. Flujos alternativos — Generar respuesta estructurada</w:t>
+        </w:r>
+        <w:r>
+          <w:rPr>
+            <w:noProof/>
+            <w:webHidden/>
+          </w:rPr>
+          <w:tab/>
+        </w:r>
+        <w:r>
+          <w:rPr>
+            <w:noProof/>
+            <w:webHidden/>
+          </w:rPr>
+          <w:fldChar w:fldCharType="begin"/>
+        </w:r>
+        <w:r>
+          <w:rPr>
+            <w:noProof/>
+            <w:webHidden/>
+          </w:rPr>
+          <w:instrText xml:space="preserve"> PAGEREF _Toc243988572 \h </w:instrText>
         </w:r>
         <w:r>
           <w:rPr>
@@ -8959,13 +9452,13 @@
           <w:lang w:val="es-MX" w:eastAsia="es-MX"/>
         </w:rPr>
       </w:pPr>
-      <w:hyperlink w:anchor="_Toc242892596" w:history="1">
+      <w:hyperlink w:anchor="_Toc243988573" w:history="1">
         <w:r>
           <w:rPr>
             <w:rStyle w:val="Hipervnculo"/>
             <w:noProof/>
           </w:rPr>
-          <w:t>Tabla 27. Flujos alternativos — Validar token</w:t>
+          <w:t>Tabla 34. ECUD — CU-08: Token inválido</w:t>
         </w:r>
         <w:r>
           <w:rPr>
@@ -8986,7 +9479,7 @@
             <w:noProof/>
             <w:webHidden/>
           </w:rPr>
-          <w:instrText xml:space="preserve"> PAGEREF _Toc242892596 \h </w:instrText>
+          <w:instrText xml:space="preserve"> PAGEREF _Toc243988573 \h </w:instrText>
         </w:r>
         <w:r>
           <w:rPr>
@@ -9030,13 +9523,13 @@
           <w:lang w:val="es-MX" w:eastAsia="es-MX"/>
         </w:rPr>
       </w:pPr>
-      <w:hyperlink w:anchor="_Toc242892597" w:history="1">
+      <w:hyperlink w:anchor="_Toc243988574" w:history="1">
         <w:r>
           <w:rPr>
             <w:rStyle w:val="Hipervnculo"/>
             <w:noProof/>
           </w:rPr>
-          <w:t>Tabla 28. ECUD — CU-06: Validar datos de conversión</w:t>
+          <w:t>Tabla 35. Flujo básico — Token inválido</w:t>
         </w:r>
         <w:r>
           <w:rPr>
@@ -9057,7 +9550,7 @@
             <w:noProof/>
             <w:webHidden/>
           </w:rPr>
-          <w:instrText xml:space="preserve"> PAGEREF _Toc242892597 \h </w:instrText>
+          <w:instrText xml:space="preserve"> PAGEREF _Toc243988574 \h </w:instrText>
         </w:r>
         <w:r>
           <w:rPr>
@@ -9101,13 +9594,13 @@
           <w:lang w:val="es-MX" w:eastAsia="es-MX"/>
         </w:rPr>
       </w:pPr>
-      <w:hyperlink w:anchor="_Toc242892598" w:history="1">
+      <w:hyperlink w:anchor="_Toc243988575" w:history="1">
         <w:r>
           <w:rPr>
             <w:rStyle w:val="Hipervnculo"/>
             <w:noProof/>
           </w:rPr>
-          <w:t>Tabla 29. Flujo básico — Validar datos de conversión</w:t>
+          <w:t>Tabla 36. Flujos alternativos — Token inválido</w:t>
         </w:r>
         <w:r>
           <w:rPr>
@@ -9128,7 +9621,7 @@
             <w:noProof/>
             <w:webHidden/>
           </w:rPr>
-          <w:instrText xml:space="preserve"> PAGEREF _Toc242892598 \h </w:instrText>
+          <w:instrText xml:space="preserve"> PAGEREF _Toc243988575 \h </w:instrText>
         </w:r>
         <w:r>
           <w:rPr>
@@ -9172,13 +9665,13 @@
           <w:lang w:val="es-MX" w:eastAsia="es-MX"/>
         </w:rPr>
       </w:pPr>
-      <w:hyperlink w:anchor="_Toc242892599" w:history="1">
+      <w:hyperlink w:anchor="_Toc243988576" w:history="1">
         <w:r>
           <w:rPr>
             <w:rStyle w:val="Hipervnculo"/>
             <w:noProof/>
           </w:rPr>
-          <w:t>Tabla 30. Flujos alternativos — Validar datos de conversión</w:t>
+          <w:t>Tabla 37. ECUD — CU-09: Sesión expirada</w:t>
         </w:r>
         <w:r>
           <w:rPr>
@@ -9199,7 +9692,7 @@
             <w:noProof/>
             <w:webHidden/>
           </w:rPr>
-          <w:instrText xml:space="preserve"> PAGEREF _Toc242892599 \h </w:instrText>
+          <w:instrText xml:space="preserve"> PAGEREF _Toc243988576 \h </w:instrText>
         </w:r>
         <w:r>
           <w:rPr>
@@ -9243,13 +9736,13 @@
           <w:lang w:val="es-MX" w:eastAsia="es-MX"/>
         </w:rPr>
       </w:pPr>
-      <w:hyperlink w:anchor="_Toc242892600" w:history="1">
+      <w:hyperlink w:anchor="_Toc243988577" w:history="1">
         <w:r>
           <w:rPr>
             <w:rStyle w:val="Hipervnculo"/>
             <w:noProof/>
           </w:rPr>
-          <w:t>Tabla 31. ECUD — CU-07: Generar respuesta estructurada</w:t>
+          <w:t>Tabla 38. Flujo básico — Sesión expirada</w:t>
         </w:r>
         <w:r>
           <w:rPr>
@@ -9270,7 +9763,7 @@
             <w:noProof/>
             <w:webHidden/>
           </w:rPr>
-          <w:instrText xml:space="preserve"> PAGEREF _Toc242892600 \h </w:instrText>
+          <w:instrText xml:space="preserve"> PAGEREF _Toc243988577 \h </w:instrText>
         </w:r>
         <w:r>
           <w:rPr>
@@ -9314,13 +9807,13 @@
           <w:lang w:val="es-MX" w:eastAsia="es-MX"/>
         </w:rPr>
       </w:pPr>
-      <w:hyperlink w:anchor="_Toc242892601" w:history="1">
+      <w:hyperlink w:anchor="_Toc243988578" w:history="1">
         <w:r>
           <w:rPr>
             <w:rStyle w:val="Hipervnculo"/>
             <w:noProof/>
           </w:rPr>
-          <w:t>Tabla 32. Flujo básico — Generar respuesta estructurada</w:t>
+          <w:t>Tabla 39. Flujos alternativos — Sesión expirada</w:t>
         </w:r>
         <w:r>
           <w:rPr>
@@ -9341,7 +9834,7 @@
             <w:noProof/>
             <w:webHidden/>
           </w:rPr>
-          <w:instrText xml:space="preserve"> PAGEREF _Toc242892601 \h </w:instrText>
+          <w:instrText xml:space="preserve"> PAGEREF _Toc243988578 \h </w:instrText>
         </w:r>
         <w:r>
           <w:rPr>
@@ -9385,13 +9878,13 @@
           <w:lang w:val="es-MX" w:eastAsia="es-MX"/>
         </w:rPr>
       </w:pPr>
-      <w:hyperlink w:anchor="_Toc242892602" w:history="1">
+      <w:hyperlink w:anchor="_Toc243988579" w:history="1">
         <w:r>
           <w:rPr>
             <w:rStyle w:val="Hipervnculo"/>
             <w:noProof/>
           </w:rPr>
-          <w:t>Tabla 33. Flujos alternativos — Generar respuesta estructurada</w:t>
+          <w:t>Tabla 40. ECUD — CU-10: Unidad no soportada</w:t>
         </w:r>
         <w:r>
           <w:rPr>
@@ -9412,7 +9905,78 @@
             <w:noProof/>
             <w:webHidden/>
           </w:rPr>
-          <w:instrText xml:space="preserve"> PAGEREF _Toc242892602 \h </w:instrText>
+          <w:instrText xml:space="preserve"> PAGEREF _Toc243988579 \h </w:instrText>
+        </w:r>
+        <w:r>
+          <w:rPr>
+            <w:noProof/>
+            <w:webHidden/>
+          </w:rPr>
+        </w:r>
+        <w:r>
+          <w:rPr>
+            <w:noProof/>
+            <w:webHidden/>
+          </w:rPr>
+          <w:fldChar w:fldCharType="separate"/>
+        </w:r>
+        <w:r>
+          <w:rPr>
+            <w:noProof/>
+            <w:webHidden/>
+          </w:rPr>
+          <w:t>15</w:t>
+        </w:r>
+        <w:r>
+          <w:rPr>
+            <w:noProof/>
+            <w:webHidden/>
+          </w:rPr>
+          <w:fldChar w:fldCharType="end"/>
+        </w:r>
+      </w:hyperlink>
+    </w:p>
+    <w:p>
+      <w:pPr>
+        <w:pStyle w:val="Tabladeilustraciones"/>
+        <w:tabs>
+          <w:tab w:val="right" w:leader="dot" w:pos="9020"/>
+        </w:tabs>
+        <w:rPr>
+          <w:rFonts w:asciiTheme="minorHAnsi" w:eastAsiaTheme="minorEastAsia" w:hAnsiTheme="minorHAnsi" w:cstheme="minorBidi"/>
+          <w:noProof/>
+          <w:sz w:val="22"/>
+          <w:lang w:val="es-MX" w:eastAsia="es-MX"/>
+        </w:rPr>
+      </w:pPr>
+      <w:hyperlink w:anchor="_Toc243988580" w:history="1">
+        <w:r>
+          <w:rPr>
+            <w:rStyle w:val="Hipervnculo"/>
+            <w:noProof/>
+          </w:rPr>
+          <w:t>Tabla 41. Flujo básico — Unidad no soportada</w:t>
+        </w:r>
+        <w:r>
+          <w:rPr>
+            <w:noProof/>
+            <w:webHidden/>
+          </w:rPr>
+          <w:tab/>
+        </w:r>
+        <w:r>
+          <w:rPr>
+            <w:noProof/>
+            <w:webHidden/>
+          </w:rPr>
+          <w:fldChar w:fldCharType="begin"/>
+        </w:r>
+        <w:r>
+          <w:rPr>
+            <w:noProof/>
+            <w:webHidden/>
+          </w:rPr>
+          <w:instrText xml:space="preserve"> PAGEREF _Toc243988580 \h </w:instrText>
         </w:r>
         <w:r>
           <w:rPr>
@@ -9456,13 +10020,13 @@
           <w:lang w:val="es-MX" w:eastAsia="es-MX"/>
         </w:rPr>
       </w:pPr>
-      <w:hyperlink w:anchor="_Toc242892603" w:history="1">
+      <w:hyperlink w:anchor="_Toc243988581" w:history="1">
         <w:r>
           <w:rPr>
             <w:rStyle w:val="Hipervnculo"/>
             <w:noProof/>
           </w:rPr>
-          <w:t>Tabla 34. ECUD — CU-08: Token inválido</w:t>
+          <w:t>Tabla 42. Flujos alternativos — Unidad no soportada</w:t>
         </w:r>
         <w:r>
           <w:rPr>
@@ -9483,7 +10047,7 @@
             <w:noProof/>
             <w:webHidden/>
           </w:rPr>
-          <w:instrText xml:space="preserve"> PAGEREF _Toc242892603 \h </w:instrText>
+          <w:instrText xml:space="preserve"> PAGEREF _Toc243988581 \h </w:instrText>
         </w:r>
         <w:r>
           <w:rPr>
@@ -9527,13 +10091,13 @@
           <w:lang w:val="es-MX" w:eastAsia="es-MX"/>
         </w:rPr>
       </w:pPr>
-      <w:hyperlink w:anchor="_Toc242892604" w:history="1">
+      <w:hyperlink w:anchor="_Toc243988582" w:history="1">
         <w:r>
           <w:rPr>
             <w:rStyle w:val="Hipervnculo"/>
             <w:noProof/>
           </w:rPr>
-          <w:t>Tabla 35. Flujo básico — Token inválido</w:t>
+          <w:t>Tabla 43. ECUD — CU-11: Datos inconsistentes</w:t>
         </w:r>
         <w:r>
           <w:rPr>
@@ -9554,7 +10118,7 @@
             <w:noProof/>
             <w:webHidden/>
           </w:rPr>
-          <w:instrText xml:space="preserve"> PAGEREF _Toc242892604 \h </w:instrText>
+          <w:instrText xml:space="preserve"> PAGEREF _Toc243988582 \h </w:instrText>
         </w:r>
         <w:r>
           <w:rPr>
@@ -9598,13 +10162,13 @@
           <w:lang w:val="es-MX" w:eastAsia="es-MX"/>
         </w:rPr>
       </w:pPr>
-      <w:hyperlink w:anchor="_Toc242892605" w:history="1">
+      <w:hyperlink w:anchor="_Toc243988583" w:history="1">
         <w:r>
           <w:rPr>
             <w:rStyle w:val="Hipervnculo"/>
             <w:noProof/>
           </w:rPr>
-          <w:t>Tabla 36. Flujos alternativos — Token inválido</w:t>
+          <w:t>Tabla 44. Flujo básico — Datos inconsistentes</w:t>
         </w:r>
         <w:r>
           <w:rPr>
@@ -9625,7 +10189,7 @@
             <w:noProof/>
             <w:webHidden/>
           </w:rPr>
-          <w:instrText xml:space="preserve"> PAGEREF _Toc242892605 \h </w:instrText>
+          <w:instrText xml:space="preserve"> PAGEREF _Toc243988583 \h </w:instrText>
         </w:r>
         <w:r>
           <w:rPr>
@@ -9669,13 +10233,13 @@
           <w:lang w:val="es-MX" w:eastAsia="es-MX"/>
         </w:rPr>
       </w:pPr>
-      <w:hyperlink w:anchor="_Toc242892606" w:history="1">
+      <w:hyperlink w:anchor="_Toc243988584" w:history="1">
         <w:r>
           <w:rPr>
             <w:rStyle w:val="Hipervnculo"/>
             <w:noProof/>
           </w:rPr>
-          <w:t>Tabla 37. ECUD — CU-09: Sesión expirada</w:t>
+          <w:t>Tabla 45. Flujos alternativos — Datos inconsistentes</w:t>
         </w:r>
         <w:r>
           <w:rPr>
@@ -9696,78 +10260,7 @@
             <w:noProof/>
             <w:webHidden/>
           </w:rPr>
-          <w:instrText xml:space="preserve"> PAGEREF _Toc242892606 \h </w:instrText>
-        </w:r>
-        <w:r>
-          <w:rPr>
-            <w:noProof/>
-            <w:webHidden/>
-          </w:rPr>
-        </w:r>
-        <w:r>
-          <w:rPr>
-            <w:noProof/>
-            <w:webHidden/>
-          </w:rPr>
-          <w:fldChar w:fldCharType="separate"/>
-        </w:r>
-        <w:r>
-          <w:rPr>
-            <w:noProof/>
-            <w:webHidden/>
-          </w:rPr>
-          <w:t>16</w:t>
-        </w:r>
-        <w:r>
-          <w:rPr>
-            <w:noProof/>
-            <w:webHidden/>
-          </w:rPr>
-          <w:fldChar w:fldCharType="end"/>
-        </w:r>
-      </w:hyperlink>
-    </w:p>
-    <w:p>
-      <w:pPr>
-        <w:pStyle w:val="Tabladeilustraciones"/>
-        <w:tabs>
-          <w:tab w:val="right" w:leader="dot" w:pos="9020"/>
-        </w:tabs>
-        <w:rPr>
-          <w:rFonts w:asciiTheme="minorHAnsi" w:eastAsiaTheme="minorEastAsia" w:hAnsiTheme="minorHAnsi" w:cstheme="minorBidi"/>
-          <w:noProof/>
-          <w:sz w:val="22"/>
-          <w:lang w:val="es-MX" w:eastAsia="es-MX"/>
-        </w:rPr>
-      </w:pPr>
-      <w:hyperlink w:anchor="_Toc242892607" w:history="1">
-        <w:r>
-          <w:rPr>
-            <w:rStyle w:val="Hipervnculo"/>
-            <w:noProof/>
-          </w:rPr>
-          <w:t>Tabla 38. Flujo básico — Sesión expirada</w:t>
-        </w:r>
-        <w:r>
-          <w:rPr>
-            <w:noProof/>
-            <w:webHidden/>
-          </w:rPr>
-          <w:tab/>
-        </w:r>
-        <w:r>
-          <w:rPr>
-            <w:noProof/>
-            <w:webHidden/>
-          </w:rPr>
-          <w:fldChar w:fldCharType="begin"/>
-        </w:r>
-        <w:r>
-          <w:rPr>
-            <w:noProof/>
-            <w:webHidden/>
-          </w:rPr>
-          <w:instrText xml:space="preserve"> PAGEREF _Toc242892607 \h </w:instrText>
+          <w:instrText xml:space="preserve"> PAGEREF _Toc243988584 \h </w:instrText>
         </w:r>
         <w:r>
           <w:rPr>
@@ -9799,503 +10292,6 @@
       </w:hyperlink>
     </w:p>
     <w:p>
-      <w:pPr>
-        <w:pStyle w:val="Tabladeilustraciones"/>
-        <w:tabs>
-          <w:tab w:val="right" w:leader="dot" w:pos="9020"/>
-        </w:tabs>
-        <w:rPr>
-          <w:rFonts w:asciiTheme="minorHAnsi" w:eastAsiaTheme="minorEastAsia" w:hAnsiTheme="minorHAnsi" w:cstheme="minorBidi"/>
-          <w:noProof/>
-          <w:sz w:val="22"/>
-          <w:lang w:val="es-MX" w:eastAsia="es-MX"/>
-        </w:rPr>
-      </w:pPr>
-      <w:hyperlink w:anchor="_Toc242892608" w:history="1">
-        <w:r>
-          <w:rPr>
-            <w:rStyle w:val="Hipervnculo"/>
-            <w:noProof/>
-          </w:rPr>
-          <w:t>Tabla 39. Flujos alternativos — Sesión expirada</w:t>
-        </w:r>
-        <w:r>
-          <w:rPr>
-            <w:noProof/>
-            <w:webHidden/>
-          </w:rPr>
-          <w:tab/>
-        </w:r>
-        <w:r>
-          <w:rPr>
-            <w:noProof/>
-            <w:webHidden/>
-          </w:rPr>
-          <w:fldChar w:fldCharType="begin"/>
-        </w:r>
-        <w:r>
-          <w:rPr>
-            <w:noProof/>
-            <w:webHidden/>
-          </w:rPr>
-          <w:instrText xml:space="preserve"> PAGEREF _Toc242892608 \h </w:instrText>
-        </w:r>
-        <w:r>
-          <w:rPr>
-            <w:noProof/>
-            <w:webHidden/>
-          </w:rPr>
-        </w:r>
-        <w:r>
-          <w:rPr>
-            <w:noProof/>
-            <w:webHidden/>
-          </w:rPr>
-          <w:fldChar w:fldCharType="separate"/>
-        </w:r>
-        <w:r>
-          <w:rPr>
-            <w:noProof/>
-            <w:webHidden/>
-          </w:rPr>
-          <w:t>17</w:t>
-        </w:r>
-        <w:r>
-          <w:rPr>
-            <w:noProof/>
-            <w:webHidden/>
-          </w:rPr>
-          <w:fldChar w:fldCharType="end"/>
-        </w:r>
-      </w:hyperlink>
-    </w:p>
-    <w:p>
-      <w:pPr>
-        <w:pStyle w:val="Tabladeilustraciones"/>
-        <w:tabs>
-          <w:tab w:val="right" w:leader="dot" w:pos="9020"/>
-        </w:tabs>
-        <w:rPr>
-          <w:rFonts w:asciiTheme="minorHAnsi" w:eastAsiaTheme="minorEastAsia" w:hAnsiTheme="minorHAnsi" w:cstheme="minorBidi"/>
-          <w:noProof/>
-          <w:sz w:val="22"/>
-          <w:lang w:val="es-MX" w:eastAsia="es-MX"/>
-        </w:rPr>
-      </w:pPr>
-      <w:hyperlink w:anchor="_Toc242892609" w:history="1">
-        <w:r>
-          <w:rPr>
-            <w:rStyle w:val="Hipervnculo"/>
-            <w:noProof/>
-          </w:rPr>
-          <w:t>Tabla 40. ECUD — CU-10: Unidad no soportada</w:t>
-        </w:r>
-        <w:r>
-          <w:rPr>
-            <w:noProof/>
-            <w:webHidden/>
-          </w:rPr>
-          <w:tab/>
-        </w:r>
-        <w:r>
-          <w:rPr>
-            <w:noProof/>
-            <w:webHidden/>
-          </w:rPr>
-          <w:fldChar w:fldCharType="begin"/>
-        </w:r>
-        <w:r>
-          <w:rPr>
-            <w:noProof/>
-            <w:webHidden/>
-          </w:rPr>
-          <w:instrText xml:space="preserve"> PAGEREF _Toc242892609 \h </w:instrText>
-        </w:r>
-        <w:r>
-          <w:rPr>
-            <w:noProof/>
-            <w:webHidden/>
-          </w:rPr>
-        </w:r>
-        <w:r>
-          <w:rPr>
-            <w:noProof/>
-            <w:webHidden/>
-          </w:rPr>
-          <w:fldChar w:fldCharType="separate"/>
-        </w:r>
-        <w:r>
-          <w:rPr>
-            <w:noProof/>
-            <w:webHidden/>
-          </w:rPr>
-          <w:t>17</w:t>
-        </w:r>
-        <w:r>
-          <w:rPr>
-            <w:noProof/>
-            <w:webHidden/>
-          </w:rPr>
-          <w:fldChar w:fldCharType="end"/>
-        </w:r>
-      </w:hyperlink>
-    </w:p>
-    <w:p>
-      <w:pPr>
-        <w:pStyle w:val="Tabladeilustraciones"/>
-        <w:tabs>
-          <w:tab w:val="right" w:leader="dot" w:pos="9020"/>
-        </w:tabs>
-        <w:rPr>
-          <w:rFonts w:asciiTheme="minorHAnsi" w:eastAsiaTheme="minorEastAsia" w:hAnsiTheme="minorHAnsi" w:cstheme="minorBidi"/>
-          <w:noProof/>
-          <w:sz w:val="22"/>
-          <w:lang w:val="es-MX" w:eastAsia="es-MX"/>
-        </w:rPr>
-      </w:pPr>
-      <w:hyperlink w:anchor="_Toc242892610" w:history="1">
-        <w:r>
-          <w:rPr>
-            <w:rStyle w:val="Hipervnculo"/>
-            <w:noProof/>
-          </w:rPr>
-          <w:t>Tabla 41. Flujo básico — Unidad no soportada</w:t>
-        </w:r>
-        <w:r>
-          <w:rPr>
-            <w:noProof/>
-            <w:webHidden/>
-          </w:rPr>
-          <w:tab/>
-        </w:r>
-        <w:r>
-          <w:rPr>
-            <w:noProof/>
-            <w:webHidden/>
-          </w:rPr>
-          <w:fldChar w:fldCharType="begin"/>
-        </w:r>
-        <w:r>
-          <w:rPr>
-            <w:noProof/>
-            <w:webHidden/>
-          </w:rPr>
-          <w:instrText xml:space="preserve"> PAGEREF _Toc242892610 \h </w:instrText>
-        </w:r>
-        <w:r>
-          <w:rPr>
-            <w:noProof/>
-            <w:webHidden/>
-          </w:rPr>
-        </w:r>
-        <w:r>
-          <w:rPr>
-            <w:noProof/>
-            <w:webHidden/>
-          </w:rPr>
-          <w:fldChar w:fldCharType="separate"/>
-        </w:r>
-        <w:r>
-          <w:rPr>
-            <w:noProof/>
-            <w:webHidden/>
-          </w:rPr>
-          <w:t>18</w:t>
-        </w:r>
-        <w:r>
-          <w:rPr>
-            <w:noProof/>
-            <w:webHidden/>
-          </w:rPr>
-          <w:fldChar w:fldCharType="end"/>
-        </w:r>
-      </w:hyperlink>
-    </w:p>
-    <w:p>
-      <w:pPr>
-        <w:pStyle w:val="Tabladeilustraciones"/>
-        <w:tabs>
-          <w:tab w:val="right" w:leader="dot" w:pos="9020"/>
-        </w:tabs>
-        <w:rPr>
-          <w:rFonts w:asciiTheme="minorHAnsi" w:eastAsiaTheme="minorEastAsia" w:hAnsiTheme="minorHAnsi" w:cstheme="minorBidi"/>
-          <w:noProof/>
-          <w:sz w:val="22"/>
-          <w:lang w:val="es-MX" w:eastAsia="es-MX"/>
-        </w:rPr>
-      </w:pPr>
-      <w:hyperlink w:anchor="_Toc242892611" w:history="1">
-        <w:r>
-          <w:rPr>
-            <w:rStyle w:val="Hipervnculo"/>
-            <w:noProof/>
-          </w:rPr>
-          <w:t>Tabla 42. Flujos alternativos — Unidad no soportada</w:t>
-        </w:r>
-        <w:r>
-          <w:rPr>
-            <w:noProof/>
-            <w:webHidden/>
-          </w:rPr>
-          <w:tab/>
-        </w:r>
-        <w:r>
-          <w:rPr>
-            <w:noProof/>
-            <w:webHidden/>
-          </w:rPr>
-          <w:fldChar w:fldCharType="begin"/>
-        </w:r>
-        <w:r>
-          <w:rPr>
-            <w:noProof/>
-            <w:webHidden/>
-          </w:rPr>
-          <w:instrText xml:space="preserve"> PAGEREF _Toc242892611 \h </w:instrText>
-        </w:r>
-        <w:r>
-          <w:rPr>
-            <w:noProof/>
-            <w:webHidden/>
-          </w:rPr>
-        </w:r>
-        <w:r>
-          <w:rPr>
-            <w:noProof/>
-            <w:webHidden/>
-          </w:rPr>
-          <w:fldChar w:fldCharType="separate"/>
-        </w:r>
-        <w:r>
-          <w:rPr>
-            <w:noProof/>
-            <w:webHidden/>
-          </w:rPr>
-          <w:t>18</w:t>
-        </w:r>
-        <w:r>
-          <w:rPr>
-            <w:noProof/>
-            <w:webHidden/>
-          </w:rPr>
-          <w:fldChar w:fldCharType="end"/>
-        </w:r>
-      </w:hyperlink>
-    </w:p>
-    <w:p>
-      <w:pPr>
-        <w:pStyle w:val="Tabladeilustraciones"/>
-        <w:tabs>
-          <w:tab w:val="right" w:leader="dot" w:pos="9020"/>
-        </w:tabs>
-        <w:rPr>
-          <w:rFonts w:asciiTheme="minorHAnsi" w:eastAsiaTheme="minorEastAsia" w:hAnsiTheme="minorHAnsi" w:cstheme="minorBidi"/>
-          <w:noProof/>
-          <w:sz w:val="22"/>
-          <w:lang w:val="es-MX" w:eastAsia="es-MX"/>
-        </w:rPr>
-      </w:pPr>
-      <w:hyperlink w:anchor="_Toc242892612" w:history="1">
-        <w:r>
-          <w:rPr>
-            <w:rStyle w:val="Hipervnculo"/>
-            <w:noProof/>
-          </w:rPr>
-          <w:t>Tabla 43. ECUD — CU-11: Datos inconsistentes</w:t>
-        </w:r>
-        <w:r>
-          <w:rPr>
-            <w:noProof/>
-            <w:webHidden/>
-          </w:rPr>
-          <w:tab/>
-        </w:r>
-        <w:r>
-          <w:rPr>
-            <w:noProof/>
-            <w:webHidden/>
-          </w:rPr>
-          <w:fldChar w:fldCharType="begin"/>
-        </w:r>
-        <w:r>
-          <w:rPr>
-            <w:noProof/>
-            <w:webHidden/>
-          </w:rPr>
-          <w:instrText xml:space="preserve"> PAGEREF _Toc242892612 \h </w:instrText>
-        </w:r>
-        <w:r>
-          <w:rPr>
-            <w:noProof/>
-            <w:webHidden/>
-          </w:rPr>
-        </w:r>
-        <w:r>
-          <w:rPr>
-            <w:noProof/>
-            <w:webHidden/>
-          </w:rPr>
-          <w:fldChar w:fldCharType="separate"/>
-        </w:r>
-        <w:r>
-          <w:rPr>
-            <w:noProof/>
-            <w:webHidden/>
-          </w:rPr>
-          <w:t>18</w:t>
-        </w:r>
-        <w:r>
-          <w:rPr>
-            <w:noProof/>
-            <w:webHidden/>
-          </w:rPr>
-          <w:fldChar w:fldCharType="end"/>
-        </w:r>
-      </w:hyperlink>
-    </w:p>
-    <w:p>
-      <w:pPr>
-        <w:pStyle w:val="Tabladeilustraciones"/>
-        <w:tabs>
-          <w:tab w:val="right" w:leader="dot" w:pos="9020"/>
-        </w:tabs>
-        <w:rPr>
-          <w:rFonts w:asciiTheme="minorHAnsi" w:eastAsiaTheme="minorEastAsia" w:hAnsiTheme="minorHAnsi" w:cstheme="minorBidi"/>
-          <w:noProof/>
-          <w:sz w:val="22"/>
-          <w:lang w:val="es-MX" w:eastAsia="es-MX"/>
-        </w:rPr>
-      </w:pPr>
-      <w:hyperlink w:anchor="_Toc242892613" w:history="1">
-        <w:r>
-          <w:rPr>
-            <w:rStyle w:val="Hipervnculo"/>
-            <w:noProof/>
-          </w:rPr>
-          <w:t>Tabla 44. Flujo básico — Datos inconsistentes</w:t>
-        </w:r>
-        <w:r>
-          <w:rPr>
-            <w:noProof/>
-            <w:webHidden/>
-          </w:rPr>
-          <w:tab/>
-        </w:r>
-        <w:r>
-          <w:rPr>
-            <w:noProof/>
-            <w:webHidden/>
-          </w:rPr>
-          <w:fldChar w:fldCharType="begin"/>
-        </w:r>
-        <w:r>
-          <w:rPr>
-            <w:noProof/>
-            <w:webHidden/>
-          </w:rPr>
-          <w:instrText xml:space="preserve"> PAGEREF _Toc242892613 \h </w:instrText>
-        </w:r>
-        <w:r>
-          <w:rPr>
-            <w:noProof/>
-            <w:webHidden/>
-          </w:rPr>
-        </w:r>
-        <w:r>
-          <w:rPr>
-            <w:noProof/>
-            <w:webHidden/>
-          </w:rPr>
-          <w:fldChar w:fldCharType="separate"/>
-        </w:r>
-        <w:r>
-          <w:rPr>
-            <w:noProof/>
-            <w:webHidden/>
-          </w:rPr>
-          <w:t>18</w:t>
-        </w:r>
-        <w:r>
-          <w:rPr>
-            <w:noProof/>
-            <w:webHidden/>
-          </w:rPr>
-          <w:fldChar w:fldCharType="end"/>
-        </w:r>
-      </w:hyperlink>
-    </w:p>
-    <w:p>
-      <w:pPr>
-        <w:pStyle w:val="Tabladeilustraciones"/>
-        <w:tabs>
-          <w:tab w:val="right" w:leader="dot" w:pos="9020"/>
-        </w:tabs>
-        <w:rPr>
-          <w:rFonts w:asciiTheme="minorHAnsi" w:eastAsiaTheme="minorEastAsia" w:hAnsiTheme="minorHAnsi" w:cstheme="minorBidi"/>
-          <w:noProof/>
-          <w:sz w:val="22"/>
-          <w:lang w:val="es-MX" w:eastAsia="es-MX"/>
-        </w:rPr>
-      </w:pPr>
-      <w:hyperlink w:anchor="_Toc242892614" w:history="1">
-        <w:r>
-          <w:rPr>
-            <w:rStyle w:val="Hipervnculo"/>
-            <w:noProof/>
-          </w:rPr>
-          <w:t>Tabla 45. Flujos alternativos — Datos inconsistentes</w:t>
-        </w:r>
-        <w:r>
-          <w:rPr>
-            <w:noProof/>
-            <w:webHidden/>
-          </w:rPr>
-          <w:tab/>
-        </w:r>
-        <w:r>
-          <w:rPr>
-            <w:noProof/>
-            <w:webHidden/>
-          </w:rPr>
-          <w:fldChar w:fldCharType="begin"/>
-        </w:r>
-        <w:r>
-          <w:rPr>
-            <w:noProof/>
-            <w:webHidden/>
-          </w:rPr>
-          <w:instrText xml:space="preserve"> PAGEREF _Toc242892614 \h </w:instrText>
-        </w:r>
-        <w:r>
-          <w:rPr>
-            <w:noProof/>
-            <w:webHidden/>
-          </w:rPr>
-        </w:r>
-        <w:r>
-          <w:rPr>
-            <w:noProof/>
-            <w:webHidden/>
-          </w:rPr>
-          <w:fldChar w:fldCharType="separate"/>
-        </w:r>
-        <w:r>
-          <w:rPr>
-            <w:noProof/>
-            <w:webHidden/>
-          </w:rPr>
-          <w:t>18</w:t>
-        </w:r>
-        <w:r>
-          <w:rPr>
-            <w:noProof/>
-            <w:webHidden/>
-          </w:rPr>
-          <w:fldChar w:fldCharType="end"/>
-        </w:r>
-      </w:hyperlink>
-    </w:p>
-    <w:p>
       <w:r>
         <w:fldChar w:fldCharType="end"/>
       </w:r>
@@ -10325,9 +10321,8 @@
         </w:numPr>
         <w:spacing w:before="240" w:line="240" w:lineRule="auto"/>
       </w:pPr>
-      <w:bookmarkStart w:id="1" w:name="_Toc242892540"/>
+      <w:bookmarkStart w:id="1" w:name="_Toc243988510"/>
       <w:r>
-        <w:lastRenderedPageBreak/>
         <w:t>Introducción</w:t>
       </w:r>
       <w:bookmarkEnd w:id="1"/>
@@ -10351,7 +10346,7 @@
         </w:numPr>
         <w:spacing w:before="240" w:line="240" w:lineRule="auto"/>
       </w:pPr>
-      <w:bookmarkStart w:id="2" w:name="_Toc242892541"/>
+      <w:bookmarkStart w:id="2" w:name="_Toc243988511"/>
       <w:r>
         <w:t>Propósito</w:t>
       </w:r>
@@ -10371,7 +10366,7 @@
         </w:numPr>
         <w:spacing w:before="240" w:line="240" w:lineRule="auto"/>
       </w:pPr>
-      <w:bookmarkStart w:id="3" w:name="_Toc242892542"/>
+      <w:bookmarkStart w:id="3" w:name="_Toc243988512"/>
       <w:r>
         <w:t>Alcance</w:t>
       </w:r>
@@ -10415,12 +10410,13 @@
         </w:numPr>
       </w:pPr>
       <w:r>
+        <w:lastRenderedPageBreak/>
         <w:t>Temperatura: celsius, fahrenheit, kelvin, newton y reaumur.</w:t>
       </w:r>
     </w:p>
     <w:p>
       <w:r>
-        <w:t>Incluye además la autenticación mediante token, la consulta del catálogo de categorías y unidades, la validación de datos y el manejo de errores con una respuesta estructurada. Las categorías volumen, tiempo y área, y las conversiones de divisas, quedan fuera de este documento hasta confirmar su alcance con el tutor.</w:t>
+        <w:t>Incluye además la autenticación mediante token, la consulta del catálogo de categorías y unidades, la validación de datos y el manejo de errores con una respuesta estructurada. Las categorías volumen, tiempo y área quedan fuera de este documento hasta confirmar su alcance con el tutor.</w:t>
       </w:r>
     </w:p>
     <w:p>
@@ -10432,7 +10428,7 @@
         </w:numPr>
         <w:spacing w:before="240" w:line="240" w:lineRule="auto"/>
       </w:pPr>
-      <w:bookmarkStart w:id="4" w:name="_Toc242892543"/>
+      <w:bookmarkStart w:id="4" w:name="_Toc243988513"/>
       <w:r>
         <w:t>Definiciones, Acrónimos y Abreviaturas</w:t>
       </w:r>
@@ -10447,7 +10443,7 @@
           <w:numId w:val="20"/>
         </w:numPr>
       </w:pPr>
-      <w:bookmarkStart w:id="5" w:name="_Toc242892544"/>
+      <w:bookmarkStart w:id="5" w:name="_Toc243988514"/>
       <w:r>
         <w:t>Definiciones</w:t>
       </w:r>
@@ -10458,7 +10454,7 @@
         <w:pStyle w:val="Descripcin"/>
         <w:keepNext/>
       </w:pPr>
-      <w:bookmarkStart w:id="6" w:name="_Toc242892570"/>
+      <w:bookmarkStart w:id="6" w:name="_Toc243988540"/>
       <w:r>
         <w:t xml:space="preserve">Tabla </w:t>
       </w:r>
@@ -10966,7 +10962,6 @@
                 <w:sz w:val="22"/>
                 <w:szCs w:val="22"/>
               </w:rPr>
-              <w:lastRenderedPageBreak/>
               <w:t>SOAP / WSDL</w:t>
             </w:r>
           </w:p>
@@ -11068,7 +11063,7 @@
           <w:numId w:val="20"/>
         </w:numPr>
       </w:pPr>
-      <w:bookmarkStart w:id="7" w:name="_Toc242892545"/>
+      <w:bookmarkStart w:id="7" w:name="_Toc243988515"/>
       <w:r>
         <w:t>Acrónimos y abreviaturas</w:t>
       </w:r>
@@ -11079,7 +11074,7 @@
         <w:pStyle w:val="Descripcin"/>
         <w:keepNext/>
       </w:pPr>
-      <w:bookmarkStart w:id="8" w:name="_Toc242892571"/>
+      <w:bookmarkStart w:id="8" w:name="_Toc243988541"/>
       <w:r>
         <w:t xml:space="preserve">Tabla </w:t>
       </w:r>
@@ -11743,7 +11738,7 @@
         </w:numPr>
         <w:spacing w:before="240" w:line="240" w:lineRule="auto"/>
       </w:pPr>
-      <w:bookmarkStart w:id="9" w:name="_Toc242892546"/>
+      <w:bookmarkStart w:id="9" w:name="_Toc243988516"/>
       <w:r>
         <w:t>Referencias</w:t>
       </w:r>
@@ -11754,7 +11749,7 @@
         <w:pStyle w:val="Descripcin"/>
         <w:keepNext/>
       </w:pPr>
-      <w:bookmarkStart w:id="10" w:name="_Toc242892572"/>
+      <w:bookmarkStart w:id="10" w:name="_Toc243988542"/>
       <w:r>
         <w:t xml:space="preserve">Tabla </w:t>
       </w:r>
@@ -12082,6 +12077,7 @@
                 <w:sz w:val="22"/>
                 <w:szCs w:val="22"/>
               </w:rPr>
+              <w:lastRenderedPageBreak/>
               <w:t>2.</w:t>
             </w:r>
           </w:p>
@@ -12333,7 +12329,7 @@
         </w:numPr>
         <w:spacing w:before="240" w:line="240" w:lineRule="auto"/>
       </w:pPr>
-      <w:bookmarkStart w:id="11" w:name="_Toc242892547"/>
+      <w:bookmarkStart w:id="11" w:name="_Toc243988517"/>
       <w:r>
         <w:t>Visión General del Documento</w:t>
       </w:r>
@@ -12353,7 +12349,7 @@
         </w:numPr>
         <w:spacing w:before="240" w:line="240" w:lineRule="auto"/>
       </w:pPr>
-      <w:bookmarkStart w:id="12" w:name="_Toc242892548"/>
+      <w:bookmarkStart w:id="12" w:name="_Toc243988518"/>
       <w:r>
         <w:t>Actores</w:t>
       </w:r>
@@ -12364,7 +12360,7 @@
         <w:pStyle w:val="Descripcin"/>
         <w:keepNext/>
       </w:pPr>
-      <w:bookmarkStart w:id="13" w:name="_Toc242892573"/>
+      <w:bookmarkStart w:id="13" w:name="_Toc243988543"/>
       <w:r>
         <w:t xml:space="preserve">Tabla </w:t>
       </w:r>
@@ -12580,9 +12576,8 @@
         <w:pStyle w:val="Descripcin"/>
         <w:keepNext/>
       </w:pPr>
-      <w:bookmarkStart w:id="14" w:name="_Toc242892574"/>
+      <w:bookmarkStart w:id="14" w:name="_Toc243988544"/>
       <w:r>
-        <w:lastRenderedPageBreak/>
         <w:t xml:space="preserve">Tabla </w:t>
       </w:r>
       <w:r>
@@ -12797,7 +12792,7 @@
         <w:pStyle w:val="Descripcin"/>
         <w:keepNext/>
       </w:pPr>
-      <w:bookmarkStart w:id="15" w:name="_Toc242892575"/>
+      <w:bookmarkStart w:id="15" w:name="_Toc243988545"/>
       <w:r>
         <w:t xml:space="preserve">Tabla </w:t>
       </w:r>
@@ -13013,7 +13008,7 @@
         <w:pStyle w:val="Descripcin"/>
         <w:keepNext/>
       </w:pPr>
-      <w:bookmarkStart w:id="16" w:name="_Toc242892576"/>
+      <w:bookmarkStart w:id="16" w:name="_Toc243988546"/>
       <w:r>
         <w:t xml:space="preserve">Tabla </w:t>
       </w:r>
@@ -13229,7 +13224,7 @@
         <w:pStyle w:val="Descripcin"/>
         <w:keepNext/>
       </w:pPr>
-      <w:bookmarkStart w:id="17" w:name="_Toc242892577"/>
+      <w:bookmarkStart w:id="17" w:name="_Toc243988547"/>
       <w:r>
         <w:t xml:space="preserve">Tabla </w:t>
       </w:r>
@@ -13404,6 +13399,7 @@
                 <w:sz w:val="22"/>
                 <w:szCs w:val="22"/>
               </w:rPr>
+              <w:lastRenderedPageBreak/>
               <w:t>Comentarios</w:t>
             </w:r>
           </w:p>
@@ -13449,7 +13445,7 @@
         </w:numPr>
         <w:spacing w:before="240" w:line="240" w:lineRule="auto"/>
       </w:pPr>
-      <w:bookmarkStart w:id="18" w:name="_Toc242892549"/>
+      <w:bookmarkStart w:id="18" w:name="_Toc243988519"/>
       <w:r>
         <w:t>Modelo de casos de uso</w:t>
       </w:r>
@@ -13464,9 +13460,8 @@
           <w:numId w:val="20"/>
         </w:numPr>
       </w:pPr>
-      <w:bookmarkStart w:id="19" w:name="_Toc242892550"/>
+      <w:bookmarkStart w:id="19" w:name="_Toc243988520"/>
       <w:r>
-        <w:lastRenderedPageBreak/>
         <w:t>Diagrama de casos de uso</w:t>
       </w:r>
       <w:bookmarkEnd w:id="19"/>
@@ -13522,7 +13517,7 @@
         <w:pStyle w:val="Descripcin"/>
         <w:keepNext/>
       </w:pPr>
-      <w:bookmarkStart w:id="20" w:name="_Toc242892569"/>
+      <w:bookmarkStart w:id="20" w:name="_Toc243988539"/>
       <w:r>
         <w:t xml:space="preserve">Ilustración </w:t>
       </w:r>
@@ -13558,7 +13553,7 @@
           <w:numId w:val="20"/>
         </w:numPr>
       </w:pPr>
-      <w:bookmarkStart w:id="21" w:name="_Toc242892551"/>
+      <w:bookmarkStart w:id="21" w:name="_Toc243988521"/>
       <w:r>
         <w:t>Lista de casos de uso</w:t>
       </w:r>
@@ -13569,7 +13564,7 @@
         <w:pStyle w:val="Descripcin"/>
         <w:keepNext/>
       </w:pPr>
-      <w:bookmarkStart w:id="22" w:name="_Toc242892578"/>
+      <w:bookmarkStart w:id="22" w:name="_Toc243988548"/>
       <w:r>
         <w:t xml:space="preserve">Tabla </w:t>
       </w:r>
@@ -15192,7 +15187,7 @@
           <w:numId w:val="20"/>
         </w:numPr>
       </w:pPr>
-      <w:bookmarkStart w:id="23" w:name="_Toc242892552"/>
+      <w:bookmarkStart w:id="23" w:name="_Toc243988522"/>
       <w:r>
         <w:t>Criterios de modelado</w:t>
       </w:r>
@@ -15212,7 +15207,7 @@
         </w:numPr>
         <w:spacing w:before="240" w:line="240" w:lineRule="auto"/>
       </w:pPr>
-      <w:bookmarkStart w:id="24" w:name="_Toc242892553"/>
+      <w:bookmarkStart w:id="24" w:name="_Toc243988523"/>
       <w:r>
         <w:t>Respuesta estructurada y códigos</w:t>
       </w:r>
@@ -15220,6 +15215,7 @@
     </w:p>
     <w:p>
       <w:r>
+        <w:lastRenderedPageBreak/>
         <w:t>Todas las operaciones devuelven la misma estructura dentro del cuerpo SOAP, tanto en éxito como en error.</w:t>
       </w:r>
     </w:p>
@@ -15228,7 +15224,7 @@
         <w:pStyle w:val="Descripcin"/>
         <w:keepNext/>
       </w:pPr>
-      <w:bookmarkStart w:id="25" w:name="_Toc242892579"/>
+      <w:bookmarkStart w:id="25" w:name="_Toc243988549"/>
       <w:r>
         <w:t xml:space="preserve">Tabla </w:t>
       </w:r>
@@ -15615,7 +15611,6 @@
                 <w:sz w:val="22"/>
                 <w:szCs w:val="22"/>
               </w:rPr>
-              <w:lastRenderedPageBreak/>
               <w:t>resultado</w:t>
             </w:r>
           </w:p>
@@ -15843,7 +15838,7 @@
         <w:pStyle w:val="Descripcin"/>
         <w:keepNext/>
       </w:pPr>
-      <w:bookmarkStart w:id="26" w:name="_Toc242892580"/>
+      <w:bookmarkStart w:id="26" w:name="_Toc243988550"/>
       <w:r>
         <w:t xml:space="preserve">Tabla </w:t>
       </w:r>
@@ -16542,7 +16537,7 @@
         </w:numPr>
         <w:spacing w:before="240" w:line="240" w:lineRule="auto"/>
       </w:pPr>
-      <w:bookmarkStart w:id="27" w:name="_Toc242892554"/>
+      <w:bookmarkStart w:id="27" w:name="_Toc243988524"/>
       <w:r>
         <w:t>Especificación de casos de uso detallada</w:t>
       </w:r>
@@ -16557,7 +16552,7 @@
           <w:numId w:val="20"/>
         </w:numPr>
       </w:pPr>
-      <w:bookmarkStart w:id="28" w:name="_Toc242892555"/>
+      <w:bookmarkStart w:id="28" w:name="_Toc243988525"/>
       <w:r>
         <w:t>CU-01: Autenticarse</w:t>
       </w:r>
@@ -16568,7 +16563,7 @@
         <w:pStyle w:val="Descripcin"/>
         <w:keepNext/>
       </w:pPr>
-      <w:bookmarkStart w:id="29" w:name="_Toc242892581"/>
+      <w:bookmarkStart w:id="29" w:name="_Toc243988551"/>
       <w:r>
         <w:t xml:space="preserve">Tabla </w:t>
       </w:r>
@@ -17399,8 +17394,9 @@
         <w:pStyle w:val="Descripcin"/>
         <w:keepNext/>
       </w:pPr>
-      <w:bookmarkStart w:id="30" w:name="_Toc242892582"/>
+      <w:bookmarkStart w:id="30" w:name="_Toc243988552"/>
       <w:r>
+        <w:lastRenderedPageBreak/>
         <w:t xml:space="preserve">Tabla </w:t>
       </w:r>
       <w:r>
@@ -17762,7 +17758,6 @@
                 <w:sz w:val="22"/>
                 <w:szCs w:val="22"/>
               </w:rPr>
-              <w:lastRenderedPageBreak/>
               <w:t>4</w:t>
             </w:r>
           </w:p>
@@ -18111,7 +18106,7 @@
         <w:pStyle w:val="Descripcin"/>
         <w:keepNext/>
       </w:pPr>
-      <w:bookmarkStart w:id="31" w:name="_Toc242892583"/>
+      <w:bookmarkStart w:id="31" w:name="_Toc243988553"/>
       <w:r>
         <w:t xml:space="preserve">Tabla </w:t>
       </w:r>
@@ -18407,7 +18402,7 @@
           <w:numId w:val="20"/>
         </w:numPr>
       </w:pPr>
-      <w:bookmarkStart w:id="32" w:name="_Toc242892556"/>
+      <w:bookmarkStart w:id="32" w:name="_Toc243988526"/>
       <w:r>
         <w:t>CU-02: Consultar catálogo</w:t>
       </w:r>
@@ -18418,7 +18413,7 @@
         <w:pStyle w:val="Descripcin"/>
         <w:keepNext/>
       </w:pPr>
-      <w:bookmarkStart w:id="33" w:name="_Toc242892584"/>
+      <w:bookmarkStart w:id="33" w:name="_Toc243988554"/>
       <w:r>
         <w:t xml:space="preserve">Tabla </w:t>
       </w:r>
@@ -19209,7 +19204,7 @@
         <w:pStyle w:val="Descripcin"/>
         <w:keepNext/>
       </w:pPr>
-      <w:bookmarkStart w:id="34" w:name="_Toc242892585"/>
+      <w:bookmarkStart w:id="34" w:name="_Toc243988555"/>
       <w:r>
         <w:t xml:space="preserve">Tabla </w:t>
       </w:r>
@@ -19427,6 +19422,7 @@
                 <w:sz w:val="22"/>
                 <w:szCs w:val="22"/>
               </w:rPr>
+              <w:lastRenderedPageBreak/>
               <w:t>2</w:t>
             </w:r>
           </w:p>
@@ -19645,7 +19641,6 @@
                 <w:sz w:val="22"/>
                 <w:szCs w:val="22"/>
               </w:rPr>
-              <w:lastRenderedPageBreak/>
               <w:t>5</w:t>
             </w:r>
           </w:p>
@@ -19849,7 +19844,7 @@
         <w:pStyle w:val="Descripcin"/>
         <w:keepNext/>
       </w:pPr>
-      <w:bookmarkStart w:id="35" w:name="_Toc242892586"/>
+      <w:bookmarkStart w:id="35" w:name="_Toc243988556"/>
       <w:r>
         <w:t xml:space="preserve">Tabla </w:t>
       </w:r>
@@ -20145,7 +20140,7 @@
           <w:numId w:val="20"/>
         </w:numPr>
       </w:pPr>
-      <w:bookmarkStart w:id="36" w:name="_Toc242892557"/>
+      <w:bookmarkStart w:id="36" w:name="_Toc243988527"/>
       <w:r>
         <w:t>CU-03: Consultar unidades por categoría</w:t>
       </w:r>
@@ -20156,7 +20151,7 @@
         <w:pStyle w:val="Descripcin"/>
         <w:keepNext/>
       </w:pPr>
-      <w:bookmarkStart w:id="37" w:name="_Toc242892587"/>
+      <w:bookmarkStart w:id="37" w:name="_Toc243988557"/>
       <w:r>
         <w:t xml:space="preserve">Tabla </w:t>
       </w:r>
@@ -20987,7 +20982,7 @@
         <w:pStyle w:val="Descripcin"/>
         <w:keepNext/>
       </w:pPr>
-      <w:bookmarkStart w:id="38" w:name="_Toc242892588"/>
+      <w:bookmarkStart w:id="38" w:name="_Toc243988558"/>
       <w:r>
         <w:t xml:space="preserve">Tabla </w:t>
       </w:r>
@@ -21423,6 +21418,7 @@
                 <w:sz w:val="22"/>
                 <w:szCs w:val="22"/>
               </w:rPr>
+              <w:lastRenderedPageBreak/>
               <w:t>5</w:t>
             </w:r>
           </w:p>
@@ -21568,7 +21564,6 @@
                 <w:sz w:val="22"/>
                 <w:szCs w:val="22"/>
               </w:rPr>
-              <w:lastRenderedPageBreak/>
               <w:t>7</w:t>
             </w:r>
           </w:p>
@@ -21627,7 +21622,7 @@
         <w:pStyle w:val="Descripcin"/>
         <w:keepNext/>
       </w:pPr>
-      <w:bookmarkStart w:id="39" w:name="_Toc242892589"/>
+      <w:bookmarkStart w:id="39" w:name="_Toc243988559"/>
       <w:r>
         <w:t xml:space="preserve">Tabla </w:t>
       </w:r>
@@ -21903,7 +21898,7 @@
           <w:numId w:val="20"/>
         </w:numPr>
       </w:pPr>
-      <w:bookmarkStart w:id="40" w:name="_Toc242892558"/>
+      <w:bookmarkStart w:id="40" w:name="_Toc243988528"/>
       <w:r>
         <w:t>CU-04: Realizar conversión</w:t>
       </w:r>
@@ -21914,7 +21909,7 @@
         <w:pStyle w:val="Descripcin"/>
         <w:keepNext/>
       </w:pPr>
-      <w:bookmarkStart w:id="41" w:name="_Toc242892590"/>
+      <w:bookmarkStart w:id="41" w:name="_Toc243988560"/>
       <w:r>
         <w:t xml:space="preserve">Tabla </w:t>
       </w:r>
@@ -22805,7 +22800,7 @@
         <w:pStyle w:val="Descripcin"/>
         <w:keepNext/>
       </w:pPr>
-      <w:bookmarkStart w:id="42" w:name="_Toc242892591"/>
+      <w:bookmarkStart w:id="42" w:name="_Toc243988561"/>
       <w:r>
         <w:t xml:space="preserve">Tabla </w:t>
       </w:r>
@@ -23096,6 +23091,7 @@
                 <w:sz w:val="22"/>
                 <w:szCs w:val="22"/>
               </w:rPr>
+              <w:lastRenderedPageBreak/>
               <w:t>3</w:t>
             </w:r>
           </w:p>
@@ -23241,7 +23237,6 @@
                 <w:sz w:val="22"/>
                 <w:szCs w:val="22"/>
               </w:rPr>
-              <w:lastRenderedPageBreak/>
               <w:t>5</w:t>
             </w:r>
           </w:p>
@@ -23517,7 +23512,7 @@
         <w:pStyle w:val="Descripcin"/>
         <w:keepNext/>
       </w:pPr>
-      <w:bookmarkStart w:id="43" w:name="_Toc242892592"/>
+      <w:bookmarkStart w:id="43" w:name="_Toc243988562"/>
       <w:r>
         <w:t xml:space="preserve">Tabla </w:t>
       </w:r>
@@ -23849,7 +23844,7 @@
         <w:pStyle w:val="Descripcin"/>
         <w:keepNext/>
       </w:pPr>
-      <w:bookmarkStart w:id="44" w:name="_Toc242892593"/>
+      <w:bookmarkStart w:id="44" w:name="_Toc243988563"/>
       <w:r>
         <w:t xml:space="preserve">Tabla </w:t>
       </w:r>
@@ -24125,7 +24120,7 @@
           <w:numId w:val="20"/>
         </w:numPr>
       </w:pPr>
-      <w:bookmarkStart w:id="45" w:name="_Toc242892559"/>
+      <w:bookmarkStart w:id="45" w:name="_Toc243988529"/>
       <w:r>
         <w:t>CU-05: Validar token</w:t>
       </w:r>
@@ -24136,7 +24131,7 @@
         <w:pStyle w:val="Descripcin"/>
         <w:keepNext/>
       </w:pPr>
-      <w:bookmarkStart w:id="46" w:name="_Toc242892594"/>
+      <w:bookmarkStart w:id="46" w:name="_Toc243988564"/>
       <w:r>
         <w:t xml:space="preserve">Tabla </w:t>
       </w:r>
@@ -24589,6 +24584,7 @@
                 <w:sz w:val="22"/>
                 <w:szCs w:val="22"/>
               </w:rPr>
+              <w:lastRenderedPageBreak/>
               <w:t>Autor(es)</w:t>
             </w:r>
           </w:p>
@@ -24811,7 +24807,6 @@
                 <w:sz w:val="22"/>
                 <w:szCs w:val="22"/>
               </w:rPr>
-              <w:lastRenderedPageBreak/>
               <w:t>Precondiciones</w:t>
             </w:r>
           </w:p>
@@ -24948,7 +24943,7 @@
         <w:pStyle w:val="Descripcin"/>
         <w:keepNext/>
       </w:pPr>
-      <w:bookmarkStart w:id="47" w:name="_Toc242892595"/>
+      <w:bookmarkStart w:id="47" w:name="_Toc243988565"/>
       <w:r>
         <w:t xml:space="preserve">Tabla </w:t>
       </w:r>
@@ -25442,7 +25437,7 @@
         <w:pStyle w:val="Descripcin"/>
         <w:keepNext/>
       </w:pPr>
-      <w:bookmarkStart w:id="48" w:name="_Toc242892596"/>
+      <w:bookmarkStart w:id="48" w:name="_Toc243988566"/>
       <w:r>
         <w:t xml:space="preserve">Tabla </w:t>
       </w:r>
@@ -25738,7 +25733,7 @@
           <w:numId w:val="20"/>
         </w:numPr>
       </w:pPr>
-      <w:bookmarkStart w:id="49" w:name="_Toc242892560"/>
+      <w:bookmarkStart w:id="49" w:name="_Toc243988530"/>
       <w:r>
         <w:t>CU-06: Validar datos de conversión</w:t>
       </w:r>
@@ -25749,7 +25744,7 @@
         <w:pStyle w:val="Descripcin"/>
         <w:keepNext/>
       </w:pPr>
-      <w:bookmarkStart w:id="50" w:name="_Toc242892597"/>
+      <w:bookmarkStart w:id="50" w:name="_Toc243988567"/>
       <w:r>
         <w:t xml:space="preserve">Tabla </w:t>
       </w:r>
@@ -26580,8 +26575,9 @@
         <w:pStyle w:val="Descripcin"/>
         <w:keepNext/>
       </w:pPr>
-      <w:bookmarkStart w:id="51" w:name="_Toc242892598"/>
+      <w:bookmarkStart w:id="51" w:name="_Toc243988568"/>
       <w:r>
+        <w:lastRenderedPageBreak/>
         <w:t xml:space="preserve">Tabla </w:t>
       </w:r>
       <w:r>
@@ -26798,7 +26794,6 @@
                 <w:sz w:val="22"/>
                 <w:szCs w:val="22"/>
               </w:rPr>
-              <w:lastRenderedPageBreak/>
               <w:t>2</w:t>
             </w:r>
           </w:p>
@@ -27147,7 +27142,7 @@
         <w:pStyle w:val="Descripcin"/>
         <w:keepNext/>
       </w:pPr>
-      <w:bookmarkStart w:id="52" w:name="_Toc242892599"/>
+      <w:bookmarkStart w:id="52" w:name="_Toc243988569"/>
       <w:r>
         <w:t xml:space="preserve">Tabla </w:t>
       </w:r>
@@ -27463,7 +27458,7 @@
           <w:numId w:val="20"/>
         </w:numPr>
       </w:pPr>
-      <w:bookmarkStart w:id="53" w:name="_Toc242892561"/>
+      <w:bookmarkStart w:id="53" w:name="_Toc243988531"/>
       <w:r>
         <w:t>CU-07: Generar respuesta estructurada</w:t>
       </w:r>
@@ -27474,7 +27469,7 @@
         <w:pStyle w:val="Descripcin"/>
         <w:keepNext/>
       </w:pPr>
-      <w:bookmarkStart w:id="54" w:name="_Toc242892600"/>
+      <w:bookmarkStart w:id="54" w:name="_Toc243988570"/>
       <w:r>
         <w:t xml:space="preserve">Tabla </w:t>
       </w:r>
@@ -28265,7 +28260,7 @@
         <w:pStyle w:val="Descripcin"/>
         <w:keepNext/>
       </w:pPr>
-      <w:bookmarkStart w:id="55" w:name="_Toc242892601"/>
+      <w:bookmarkStart w:id="55" w:name="_Toc243988571"/>
       <w:r>
         <w:t xml:space="preserve">Tabla </w:t>
       </w:r>
@@ -28628,6 +28623,7 @@
                 <w:sz w:val="22"/>
                 <w:szCs w:val="22"/>
               </w:rPr>
+              <w:lastRenderedPageBreak/>
               <w:t>4</w:t>
             </w:r>
           </w:p>
@@ -28686,9 +28682,8 @@
         <w:pStyle w:val="Descripcin"/>
         <w:keepNext/>
       </w:pPr>
-      <w:bookmarkStart w:id="56" w:name="_Toc242892602"/>
+      <w:bookmarkStart w:id="56" w:name="_Toc243988572"/>
       <w:r>
-        <w:lastRenderedPageBreak/>
         <w:t xml:space="preserve">Tabla </w:t>
       </w:r>
       <w:r>
@@ -28963,7 +28958,7 @@
           <w:numId w:val="20"/>
         </w:numPr>
       </w:pPr>
-      <w:bookmarkStart w:id="57" w:name="_Toc242892562"/>
+      <w:bookmarkStart w:id="57" w:name="_Toc243988532"/>
       <w:r>
         <w:t>CU-08: Token inválido</w:t>
       </w:r>
@@ -28974,7 +28969,7 @@
         <w:pStyle w:val="Descripcin"/>
         <w:keepNext/>
       </w:pPr>
-      <w:bookmarkStart w:id="58" w:name="_Toc242892603"/>
+      <w:bookmarkStart w:id="58" w:name="_Toc243988573"/>
       <w:r>
         <w:t xml:space="preserve">Tabla </w:t>
       </w:r>
@@ -29745,7 +29740,7 @@
         <w:pStyle w:val="Descripcin"/>
         <w:keepNext/>
       </w:pPr>
-      <w:bookmarkStart w:id="59" w:name="_Toc242892604"/>
+      <w:bookmarkStart w:id="59" w:name="_Toc243988574"/>
       <w:r>
         <w:t xml:space="preserve">Tabla </w:t>
       </w:r>
@@ -30166,7 +30161,7 @@
         <w:pStyle w:val="Descripcin"/>
         <w:keepNext/>
       </w:pPr>
-      <w:bookmarkStart w:id="60" w:name="_Toc242892605"/>
+      <w:bookmarkStart w:id="60" w:name="_Toc243988575"/>
       <w:r>
         <w:t xml:space="preserve">Tabla </w:t>
       </w:r>
@@ -30442,8 +30437,9 @@
           <w:numId w:val="20"/>
         </w:numPr>
       </w:pPr>
-      <w:bookmarkStart w:id="61" w:name="_Toc242892563"/>
+      <w:bookmarkStart w:id="61" w:name="_Toc243988533"/>
       <w:r>
+        <w:lastRenderedPageBreak/>
         <w:t>CU-09: Sesión expirada</w:t>
       </w:r>
       <w:bookmarkEnd w:id="61"/>
@@ -30453,7 +30449,7 @@
         <w:pStyle w:val="Descripcin"/>
         <w:keepNext/>
       </w:pPr>
-      <w:bookmarkStart w:id="62" w:name="_Toc242892606"/>
+      <w:bookmarkStart w:id="62" w:name="_Toc243988576"/>
       <w:r>
         <w:t xml:space="preserve">Tabla </w:t>
       </w:r>
@@ -30684,7 +30680,6 @@
                 <w:sz w:val="22"/>
                 <w:szCs w:val="22"/>
               </w:rPr>
-              <w:lastRenderedPageBreak/>
               <w:t>Descripción</w:t>
             </w:r>
           </w:p>
@@ -31225,7 +31220,7 @@
         <w:pStyle w:val="Descripcin"/>
         <w:keepNext/>
       </w:pPr>
-      <w:bookmarkStart w:id="63" w:name="_Toc242892607"/>
+      <w:bookmarkStart w:id="63" w:name="_Toc243988577"/>
       <w:r>
         <w:t xml:space="preserve">Tabla </w:t>
       </w:r>
@@ -31646,7 +31641,7 @@
         <w:pStyle w:val="Descripcin"/>
         <w:keepNext/>
       </w:pPr>
-      <w:bookmarkStart w:id="64" w:name="_Toc242892608"/>
+      <w:bookmarkStart w:id="64" w:name="_Toc243988578"/>
       <w:r>
         <w:t xml:space="preserve">Tabla </w:t>
       </w:r>
@@ -31922,7 +31917,7 @@
           <w:numId w:val="20"/>
         </w:numPr>
       </w:pPr>
-      <w:bookmarkStart w:id="65" w:name="_Toc242892564"/>
+      <w:bookmarkStart w:id="65" w:name="_Toc243988534"/>
       <w:r>
         <w:t>CU-10: Unidad no soportada</w:t>
       </w:r>
@@ -31933,7 +31928,7 @@
         <w:pStyle w:val="Descripcin"/>
         <w:keepNext/>
       </w:pPr>
-      <w:bookmarkStart w:id="66" w:name="_Toc242892609"/>
+      <w:bookmarkStart w:id="66" w:name="_Toc243988579"/>
       <w:r>
         <w:t xml:space="preserve">Tabla </w:t>
       </w:r>
@@ -32663,6 +32658,7 @@
                 <w:sz w:val="22"/>
                 <w:szCs w:val="22"/>
               </w:rPr>
+              <w:lastRenderedPageBreak/>
               <w:t>Postcondiciones</w:t>
             </w:r>
           </w:p>
@@ -32704,9 +32700,8 @@
         <w:pStyle w:val="Descripcin"/>
         <w:keepNext/>
       </w:pPr>
-      <w:bookmarkStart w:id="67" w:name="_Toc242892610"/>
+      <w:bookmarkStart w:id="67" w:name="_Toc243988580"/>
       <w:r>
-        <w:lastRenderedPageBreak/>
         <w:t xml:space="preserve">Tabla </w:t>
       </w:r>
       <w:r>
@@ -33126,7 +33121,7 @@
         <w:pStyle w:val="Descripcin"/>
         <w:keepNext/>
       </w:pPr>
-      <w:bookmarkStart w:id="68" w:name="_Toc242892611"/>
+      <w:bookmarkStart w:id="68" w:name="_Toc243988581"/>
       <w:r>
         <w:t xml:space="preserve">Tabla </w:t>
       </w:r>
@@ -33402,7 +33397,7 @@
           <w:numId w:val="20"/>
         </w:numPr>
       </w:pPr>
-      <w:bookmarkStart w:id="69" w:name="_Toc242892565"/>
+      <w:bookmarkStart w:id="69" w:name="_Toc243988535"/>
       <w:r>
         <w:t>CU-11: Datos inconsistentes</w:t>
       </w:r>
@@ -33413,7 +33408,7 @@
         <w:pStyle w:val="Descripcin"/>
         <w:keepNext/>
       </w:pPr>
-      <w:bookmarkStart w:id="70" w:name="_Toc242892612"/>
+      <w:bookmarkStart w:id="70" w:name="_Toc243988582"/>
       <w:r>
         <w:t xml:space="preserve">Tabla </w:t>
       </w:r>
@@ -34204,7 +34199,7 @@
         <w:pStyle w:val="Descripcin"/>
         <w:keepNext/>
       </w:pPr>
-      <w:bookmarkStart w:id="71" w:name="_Toc242892613"/>
+      <w:bookmarkStart w:id="71" w:name="_Toc243988583"/>
       <w:r>
         <w:t xml:space="preserve">Tabla </w:t>
       </w:r>
@@ -34625,7 +34620,7 @@
         <w:pStyle w:val="Descripcin"/>
         <w:keepNext/>
       </w:pPr>
-      <w:bookmarkStart w:id="72" w:name="_Toc242892614"/>
+      <w:bookmarkStart w:id="72" w:name="_Toc243988584"/>
       <w:r>
         <w:t xml:space="preserve">Tabla </w:t>
       </w:r>
@@ -34800,7 +34795,6 @@
                 <w:sz w:val="22"/>
                 <w:szCs w:val="22"/>
               </w:rPr>
-              <w:lastRenderedPageBreak/>
               <w:t>Casos de uso incluidos</w:t>
             </w:r>
           </w:p>
@@ -34898,7 +34892,7 @@
         <w:pStyle w:val="Ttulo1"/>
         <w:spacing w:before="240" w:line="240" w:lineRule="auto"/>
       </w:pPr>
-      <w:bookmarkStart w:id="73" w:name="_Toc242892566"/>
+      <w:bookmarkStart w:id="73" w:name="_Toc243988536"/>
       <w:r>
         <w:t>Recomendaciones</w:t>
       </w:r>
@@ -34913,7 +34907,7 @@
         </w:numPr>
       </w:pPr>
       <w:r>
-        <w:t>Confirmar con el tutor si el alcance incluye las categorías volumen, tiempo y área y las conversiones de divisas, antes de implementar el servidor.</w:t>
+        <w:t>Confirmar con el tutor si el alcance incluye las categorías volumen, tiempo y área, antes de implementar el servidor.</w:t>
       </w:r>
     </w:p>
     <w:p>
@@ -34933,7 +34927,7 @@
         <w:pStyle w:val="Ttulo1"/>
         <w:spacing w:before="240" w:line="240" w:lineRule="auto"/>
       </w:pPr>
-      <w:bookmarkStart w:id="74" w:name="_Toc242892567"/>
+      <w:bookmarkStart w:id="74" w:name="_Toc243988537"/>
       <w:r>
         <w:t>Conclusiones</w:t>
       </w:r>
@@ -34968,7 +34962,7 @@
         <w:pStyle w:val="Ttulo1"/>
         <w:spacing w:before="240" w:line="240" w:lineRule="auto"/>
       </w:pPr>
-      <w:bookmarkStart w:id="75" w:name="_Toc242892568"/>
+      <w:bookmarkStart w:id="75" w:name="_Toc243988538"/>
       <w:r>
         <w:t>Bibliografía</w:t>
       </w:r>
@@ -34999,6 +34993,7 @@
       </w:r>
     </w:p>
     <w:sectPr>
+      <w:type w:val="continuous"/>
       <w:pgSz w:w="11910" w:h="16840"/>
       <w:pgMar w:top="740" w:right="1320" w:bottom="1180" w:left="1160" w:header="0" w:footer="996" w:gutter="0"/>
       <w:pgBorders w:offsetFrom="page">
@@ -35008,6 +35003,7 @@
         <w:right w:val="twistedLines1" w:sz="15" w:space="24" w:color="auto"/>
       </w:pgBorders>
       <w:cols w:space="720"/>
+      <w:docGrid w:linePitch="326"/>
     </w:sectPr>
   </w:body>
 </w:document>

</xml_diff>